<commit_message>
Fix style issue in SV docx export
Change style, text center, etc.
</commit_message>
<xml_diff>
--- a/sv/doc_templates/detection.docx
+++ b/sv/doc_templates/detection.docx
@@ -13,15 +13,7 @@
       </w:pPr>
       <w:r>
         <w:rPr/>
-        <w:t xml:space="preserve">{%p for </w:t>
-      </w:r>
-      <w:r>
-        <w:rPr/>
-        <w:t>object</w:t>
-      </w:r>
-      <w:r>
-        <w:rPr/>
-        <w:t xml:space="preserve"> in </w:t>
+        <w:t xml:space="preserve">{%p for object in </w:t>
       </w:r>
       <w:bookmarkStart w:id="0" w:name="__DdeLink__583_307541713"/>
       <w:r>
@@ -43,13 +35,17 @@
         </w:numPr>
         <w:jc w:val="center"/>
         <w:rPr>
-          <w:rFonts w:ascii="Calibri" w:hAnsi="Calibri" w:cs="Calibri" w:asciiTheme="minorHAnsi" w:cstheme="minorHAnsi" w:hAnsiTheme="minorHAnsi"/>
+          <w:rFonts w:cs="" w:asciiTheme="minorHAnsi" w:cstheme="minorHAnsi" w:hAnsiTheme="minorHAnsi"/>
           <w:sz w:val="24"/>
           <w:szCs w:val="24"/>
         </w:rPr>
       </w:pPr>
       <w:r>
-        <w:rPr/>
+        <w:rPr>
+          <w:rFonts w:cs="" w:asciiTheme="minorHAnsi" w:cstheme="minorHAnsi" w:hAnsiTheme="minorHAnsi"/>
+          <w:sz w:val="24"/>
+          <w:szCs w:val="24"/>
+        </w:rPr>
       </w:r>
     </w:p>
     <w:p>
@@ -61,14 +57,14 @@
         </w:numPr>
         <w:jc w:val="center"/>
         <w:rPr>
-          <w:rFonts w:ascii="Calibri" w:hAnsi="Calibri" w:cs="Calibri" w:asciiTheme="minorHAnsi" w:cstheme="minorHAnsi" w:hAnsiTheme="minorHAnsi"/>
+          <w:rFonts w:cs="" w:asciiTheme="minorHAnsi" w:cstheme="minorHAnsi" w:hAnsiTheme="minorHAnsi"/>
           <w:sz w:val="24"/>
           <w:szCs w:val="24"/>
         </w:rPr>
       </w:pPr>
       <w:r>
         <w:rPr>
-          <w:rFonts w:cs="Calibri" w:ascii="Calibri" w:hAnsi="Calibri" w:asciiTheme="minorHAnsi" w:cstheme="minorHAnsi" w:hAnsiTheme="minorHAnsi"/>
+          <w:rFonts w:cs="" w:asciiTheme="minorHAnsi" w:cstheme="minorHAnsi" w:hAnsiTheme="minorHAnsi"/>
           <w:sz w:val="24"/>
           <w:szCs w:val="24"/>
         </w:rPr>
@@ -80,13 +76,17 @@
         <w:pStyle w:val="Corpsdetexte"/>
         <w:jc w:val="center"/>
         <w:rPr>
-          <w:rFonts w:ascii="Calibri" w:hAnsi="Calibri" w:cs="Calibri" w:asciiTheme="minorHAnsi" w:cstheme="minorHAnsi" w:hAnsiTheme="minorHAnsi"/>
+          <w:rFonts w:cs="" w:asciiTheme="minorHAnsi" w:cstheme="minorHAnsi" w:hAnsiTheme="minorHAnsi"/>
           <w:sz w:val="24"/>
           <w:szCs w:val="24"/>
         </w:rPr>
       </w:pPr>
       <w:r>
-        <w:rPr/>
+        <w:rPr>
+          <w:rFonts w:cs="" w:asciiTheme="minorHAnsi" w:cstheme="minorHAnsi" w:hAnsiTheme="minorHAnsi"/>
+          <w:sz w:val="24"/>
+          <w:szCs w:val="24"/>
+        </w:rPr>
       </w:r>
     </w:p>
     <w:p>
@@ -227,31 +227,19 @@
       </w:r>
       <w:r>
         <w:rPr>
-          <w:rFonts w:cs="Calibri" w:ascii="Calibri" w:hAnsi="Calibri" w:asciiTheme="minorHAnsi" w:cstheme="minorHAnsi" w:hAnsiTheme="minorHAnsi"/>
-          <w:sz w:val="20"/>
-          <w:szCs w:val="20"/>
-        </w:rPr>
-        <w:t>{% if object.date_premier_signalement %</w:t>
-      </w:r>
-      <w:r>
-        <w:rPr>
-          <w:rFonts w:cs="Calibri" w:ascii="Calibri" w:hAnsi="Calibri" w:asciiTheme="minorHAnsi" w:cstheme="minorHAnsi" w:hAnsiTheme="minorHAnsi"/>
-          <w:sz w:val="20"/>
-          <w:szCs w:val="20"/>
-        </w:rPr>
-        <w:t>}</w:t>
-      </w:r>
-      <w:r>
-        <w:rPr/>
-        <w:t>{{ object.date_premier_signalement.strftime("%Y-%m-%d %H:%M") }}</w:t>
-      </w:r>
-      <w:r>
-        <w:rPr/>
-        <w:t>{% else %}-</w:t>
-      </w:r>
-      <w:r>
-        <w:rPr>
-          <w:rFonts w:cs="Calibri" w:ascii="Calibri" w:hAnsi="Calibri" w:asciiTheme="minorHAnsi" w:cstheme="minorHAnsi" w:hAnsiTheme="minorHAnsi"/>
+          <w:rFonts w:cs="" w:asciiTheme="minorHAnsi" w:cstheme="minorHAnsi" w:hAnsiTheme="minorHAnsi"/>
+          <w:sz w:val="20"/>
+          <w:szCs w:val="20"/>
+        </w:rPr>
+        <w:t>{% if object.date_premier_signalement %}</w:t>
+      </w:r>
+      <w:r>
+        <w:rPr/>
+        <w:t>{{ object.date_premier_signalement.strftime("%Y-%m-%d %H:%M") }}{% else %}-</w:t>
+      </w:r>
+      <w:r>
+        <w:rPr>
+          <w:rFonts w:cs="" w:asciiTheme="minorHAnsi" w:cstheme="minorHAnsi" w:hAnsiTheme="minorHAnsi"/>
           <w:sz w:val="20"/>
           <w:szCs w:val="20"/>
         </w:rPr>
@@ -303,7 +291,7 @@
       </w:pPr>
       <w:r>
         <w:rPr>
-          <w:rFonts w:cs="Calibri" w:ascii="Calibri" w:hAnsi="Calibri" w:asciiTheme="minorHAnsi" w:cstheme="minorHAnsi" w:hAnsiTheme="minorHAnsi"/>
+          <w:rFonts w:cs="" w:asciiTheme="minorHAnsi" w:cstheme="minorHAnsi" w:hAnsiTheme="minorHAnsi"/>
           <w:sz w:val="20"/>
           <w:szCs w:val="20"/>
         </w:rPr>
@@ -314,24 +302,24 @@
       <w:pPr>
         <w:pStyle w:val="Lignehorizontale"/>
         <w:rPr>
-          <w:rFonts w:ascii="Calibri" w:hAnsi="Calibri" w:cs="Calibri" w:asciiTheme="minorHAnsi" w:cstheme="minorHAnsi" w:hAnsiTheme="minorHAnsi"/>
-          <w:sz w:val="20"/>
-          <w:szCs w:val="20"/>
-        </w:rPr>
-      </w:pPr>
-      <w:r>
-        <w:rPr>
-          <w:rFonts w:cs="Calibri" w:cstheme="minorHAnsi" w:ascii="Calibri" w:hAnsi="Calibri"/>
-          <w:sz w:val="20"/>
-          <w:szCs w:val="20"/>
-        </w:rPr>
-      </w:r>
-    </w:p>
-    <w:p>
-      <w:pPr>
-        <w:pStyle w:val="Corpsdetexte"/>
-        <w:rPr>
-          <w:rFonts w:ascii="Calibri" w:hAnsi="Calibri" w:cs="Calibri" w:asciiTheme="minorHAnsi" w:cstheme="minorHAnsi" w:hAnsiTheme="minorHAnsi"/>
+          <w:rFonts w:cs="" w:asciiTheme="minorHAnsi" w:cstheme="minorHAnsi" w:hAnsiTheme="minorHAnsi"/>
+          <w:sz w:val="20"/>
+          <w:szCs w:val="20"/>
+        </w:rPr>
+      </w:pPr>
+      <w:r>
+        <w:rPr>
+          <w:rFonts w:cs="" w:asciiTheme="minorHAnsi" w:cstheme="minorHAnsi" w:hAnsiTheme="minorHAnsi"/>
+          <w:sz w:val="20"/>
+          <w:szCs w:val="20"/>
+        </w:rPr>
+      </w:r>
+    </w:p>
+    <w:p>
+      <w:pPr>
+        <w:pStyle w:val="Corpsdetexte"/>
+        <w:rPr>
+          <w:rFonts w:cs="" w:asciiTheme="minorHAnsi" w:cstheme="minorHAnsi" w:hAnsiTheme="minorHAnsi"/>
           <w:sz w:val="20"/>
           <w:szCs w:val="20"/>
         </w:rPr>
@@ -345,7 +333,7 @@
       <w:pPr>
         <w:pStyle w:val="Corpsdetexte"/>
         <w:rPr>
-          <w:rFonts w:ascii="Calibri" w:hAnsi="Calibri" w:cs="Calibri" w:asciiTheme="minorHAnsi" w:cstheme="minorHAnsi" w:hAnsiTheme="minorHAnsi"/>
+          <w:rFonts w:cs="" w:asciiTheme="minorHAnsi" w:cstheme="minorHAnsi" w:hAnsiTheme="minorHAnsi"/>
           <w:sz w:val="20"/>
           <w:szCs w:val="20"/>
         </w:rPr>
@@ -359,7 +347,7 @@
       <w:pPr>
         <w:pStyle w:val="Normal"/>
         <w:rPr>
-          <w:rFonts w:ascii="Calibri" w:hAnsi="Calibri" w:cs="Calibri" w:asciiTheme="minorHAnsi" w:cstheme="minorHAnsi" w:hAnsiTheme="minorHAnsi"/>
+          <w:rFonts w:cs="" w:asciiTheme="minorHAnsi" w:cstheme="minorHAnsi" w:hAnsiTheme="minorHAnsi"/>
           <w:sz w:val="20"/>
           <w:szCs w:val="20"/>
         </w:rPr>
@@ -373,20 +361,24 @@
       <w:pPr>
         <w:pStyle w:val="Normal"/>
         <w:rPr>
-          <w:rFonts w:ascii="Calibri" w:hAnsi="Calibri" w:cs="Calibri" w:asciiTheme="minorHAnsi" w:cstheme="minorHAnsi" w:hAnsiTheme="minorHAnsi"/>
-          <w:sz w:val="20"/>
-          <w:szCs w:val="20"/>
-        </w:rPr>
-      </w:pPr>
-      <w:r>
-        <w:rPr/>
-      </w:r>
-    </w:p>
-    <w:p>
-      <w:pPr>
-        <w:pStyle w:val="Normal"/>
-        <w:rPr>
-          <w:rFonts w:ascii="Calibri" w:hAnsi="Calibri" w:cs="Calibri" w:asciiTheme="minorHAnsi" w:cstheme="minorHAnsi" w:hAnsiTheme="minorHAnsi"/>
+          <w:rFonts w:cs="" w:asciiTheme="minorHAnsi" w:cstheme="minorHAnsi" w:hAnsiTheme="minorHAnsi"/>
+          <w:sz w:val="20"/>
+          <w:szCs w:val="20"/>
+        </w:rPr>
+      </w:pPr>
+      <w:r>
+        <w:rPr>
+          <w:rFonts w:cs="" w:asciiTheme="minorHAnsi" w:cstheme="minorHAnsi" w:hAnsiTheme="minorHAnsi"/>
+          <w:sz w:val="20"/>
+          <w:szCs w:val="20"/>
+        </w:rPr>
+      </w:r>
+    </w:p>
+    <w:p>
+      <w:pPr>
+        <w:pStyle w:val="Normal"/>
+        <w:rPr>
+          <w:rFonts w:cs="" w:asciiTheme="minorHAnsi" w:cstheme="minorHAnsi" w:hAnsiTheme="minorHAnsi"/>
           <w:sz w:val="20"/>
           <w:szCs w:val="20"/>
         </w:rPr>
@@ -400,20 +392,24 @@
       <w:pPr>
         <w:pStyle w:val="Normal"/>
         <w:rPr>
-          <w:rFonts w:ascii="Calibri" w:hAnsi="Calibri" w:cs="Calibri" w:asciiTheme="minorHAnsi" w:cstheme="minorHAnsi" w:hAnsiTheme="minorHAnsi"/>
-          <w:sz w:val="20"/>
-          <w:szCs w:val="20"/>
-        </w:rPr>
-      </w:pPr>
-      <w:r>
-        <w:rPr/>
-      </w:r>
-    </w:p>
-    <w:p>
-      <w:pPr>
-        <w:pStyle w:val="Normal"/>
-        <w:rPr>
-          <w:rFonts w:ascii="Calibri" w:hAnsi="Calibri" w:cs="Calibri" w:asciiTheme="minorHAnsi" w:cstheme="minorHAnsi" w:hAnsiTheme="minorHAnsi"/>
+          <w:rFonts w:cs="" w:asciiTheme="minorHAnsi" w:cstheme="minorHAnsi" w:hAnsiTheme="minorHAnsi"/>
+          <w:sz w:val="20"/>
+          <w:szCs w:val="20"/>
+        </w:rPr>
+      </w:pPr>
+      <w:r>
+        <w:rPr>
+          <w:rFonts w:cs="" w:asciiTheme="minorHAnsi" w:cstheme="minorHAnsi" w:hAnsiTheme="minorHAnsi"/>
+          <w:sz w:val="20"/>
+          <w:szCs w:val="20"/>
+        </w:rPr>
+      </w:r>
+    </w:p>
+    <w:p>
+      <w:pPr>
+        <w:pStyle w:val="Normal"/>
+        <w:rPr>
+          <w:rFonts w:cs="" w:asciiTheme="minorHAnsi" w:cstheme="minorHAnsi" w:hAnsiTheme="minorHAnsi"/>
           <w:sz w:val="20"/>
           <w:szCs w:val="20"/>
         </w:rPr>
@@ -427,20 +423,24 @@
       <w:pPr>
         <w:pStyle w:val="Normal"/>
         <w:rPr>
-          <w:rFonts w:ascii="Calibri" w:hAnsi="Calibri" w:cs="Calibri" w:asciiTheme="minorHAnsi" w:cstheme="minorHAnsi" w:hAnsiTheme="minorHAnsi"/>
-          <w:sz w:val="20"/>
-          <w:szCs w:val="20"/>
-        </w:rPr>
-      </w:pPr>
-      <w:r>
-        <w:rPr/>
-      </w:r>
-    </w:p>
-    <w:p>
-      <w:pPr>
-        <w:pStyle w:val="Normal"/>
-        <w:rPr>
-          <w:rFonts w:ascii="Calibri" w:hAnsi="Calibri" w:cs="Calibri" w:asciiTheme="minorHAnsi" w:cstheme="minorHAnsi" w:hAnsiTheme="minorHAnsi"/>
+          <w:rFonts w:cs="" w:asciiTheme="minorHAnsi" w:cstheme="minorHAnsi" w:hAnsiTheme="minorHAnsi"/>
+          <w:sz w:val="20"/>
+          <w:szCs w:val="20"/>
+        </w:rPr>
+      </w:pPr>
+      <w:r>
+        <w:rPr>
+          <w:rFonts w:cs="" w:asciiTheme="minorHAnsi" w:cstheme="minorHAnsi" w:hAnsiTheme="minorHAnsi"/>
+          <w:sz w:val="20"/>
+          <w:szCs w:val="20"/>
+        </w:rPr>
+      </w:r>
+    </w:p>
+    <w:p>
+      <w:pPr>
+        <w:pStyle w:val="Normal"/>
+        <w:rPr>
+          <w:rFonts w:cs="" w:asciiTheme="minorHAnsi" w:cstheme="minorHAnsi" w:hAnsiTheme="minorHAnsi"/>
           <w:sz w:val="20"/>
           <w:szCs w:val="20"/>
         </w:rPr>
@@ -454,20 +454,24 @@
       <w:pPr>
         <w:pStyle w:val="Normal"/>
         <w:rPr>
-          <w:rFonts w:ascii="Calibri" w:hAnsi="Calibri" w:cs="Calibri" w:asciiTheme="minorHAnsi" w:cstheme="minorHAnsi" w:hAnsiTheme="minorHAnsi"/>
-          <w:sz w:val="20"/>
-          <w:szCs w:val="20"/>
-        </w:rPr>
-      </w:pPr>
-      <w:r>
-        <w:rPr/>
-      </w:r>
-    </w:p>
-    <w:p>
-      <w:pPr>
-        <w:pStyle w:val="Normal"/>
-        <w:rPr>
-          <w:rFonts w:ascii="Calibri" w:hAnsi="Calibri" w:cs="Calibri" w:asciiTheme="minorHAnsi" w:cstheme="minorHAnsi" w:hAnsiTheme="minorHAnsi"/>
+          <w:rFonts w:cs="" w:asciiTheme="minorHAnsi" w:cstheme="minorHAnsi" w:hAnsiTheme="minorHAnsi"/>
+          <w:sz w:val="20"/>
+          <w:szCs w:val="20"/>
+        </w:rPr>
+      </w:pPr>
+      <w:r>
+        <w:rPr>
+          <w:rFonts w:cs="" w:asciiTheme="minorHAnsi" w:cstheme="minorHAnsi" w:hAnsiTheme="minorHAnsi"/>
+          <w:sz w:val="20"/>
+          <w:szCs w:val="20"/>
+        </w:rPr>
+      </w:r>
+    </w:p>
+    <w:p>
+      <w:pPr>
+        <w:pStyle w:val="Normal"/>
+        <w:rPr>
+          <w:rFonts w:cs="" w:asciiTheme="minorHAnsi" w:cstheme="minorHAnsi" w:hAnsiTheme="minorHAnsi"/>
           <w:sz w:val="20"/>
           <w:szCs w:val="20"/>
         </w:rPr>
@@ -481,20 +485,24 @@
       <w:pPr>
         <w:pStyle w:val="Normal"/>
         <w:rPr>
-          <w:rFonts w:ascii="Calibri" w:hAnsi="Calibri" w:cs="Calibri" w:asciiTheme="minorHAnsi" w:cstheme="minorHAnsi" w:hAnsiTheme="minorHAnsi"/>
-          <w:sz w:val="20"/>
-          <w:szCs w:val="20"/>
-        </w:rPr>
-      </w:pPr>
-      <w:r>
-        <w:rPr/>
-      </w:r>
-    </w:p>
-    <w:p>
-      <w:pPr>
-        <w:pStyle w:val="Normal"/>
-        <w:rPr>
-          <w:rFonts w:ascii="Calibri" w:hAnsi="Calibri" w:cs="Calibri" w:asciiTheme="minorHAnsi" w:cstheme="minorHAnsi" w:hAnsiTheme="minorHAnsi"/>
+          <w:rFonts w:cs="" w:asciiTheme="minorHAnsi" w:cstheme="minorHAnsi" w:hAnsiTheme="minorHAnsi"/>
+          <w:sz w:val="20"/>
+          <w:szCs w:val="20"/>
+        </w:rPr>
+      </w:pPr>
+      <w:r>
+        <w:rPr>
+          <w:rFonts w:cs="" w:asciiTheme="minorHAnsi" w:cstheme="minorHAnsi" w:hAnsiTheme="minorHAnsi"/>
+          <w:sz w:val="20"/>
+          <w:szCs w:val="20"/>
+        </w:rPr>
+      </w:r>
+    </w:p>
+    <w:p>
+      <w:pPr>
+        <w:pStyle w:val="Normal"/>
+        <w:rPr>
+          <w:rFonts w:cs="" w:asciiTheme="minorHAnsi" w:cstheme="minorHAnsi" w:hAnsiTheme="minorHAnsi"/>
           <w:sz w:val="20"/>
           <w:szCs w:val="20"/>
         </w:rPr>
@@ -508,20 +516,24 @@
       <w:pPr>
         <w:pStyle w:val="Normal"/>
         <w:rPr>
-          <w:rFonts w:ascii="Calibri" w:hAnsi="Calibri" w:cs="Calibri" w:asciiTheme="minorHAnsi" w:cstheme="minorHAnsi" w:hAnsiTheme="minorHAnsi"/>
-          <w:sz w:val="20"/>
-          <w:szCs w:val="20"/>
-        </w:rPr>
-      </w:pPr>
-      <w:r>
-        <w:rPr/>
-      </w:r>
-    </w:p>
-    <w:p>
-      <w:pPr>
-        <w:pStyle w:val="Normal"/>
-        <w:rPr>
-          <w:rFonts w:ascii="Calibri" w:hAnsi="Calibri" w:cs="Calibri" w:asciiTheme="minorHAnsi" w:cstheme="minorHAnsi" w:hAnsiTheme="minorHAnsi"/>
+          <w:rFonts w:cs="" w:asciiTheme="minorHAnsi" w:cstheme="minorHAnsi" w:hAnsiTheme="minorHAnsi"/>
+          <w:sz w:val="20"/>
+          <w:szCs w:val="20"/>
+        </w:rPr>
+      </w:pPr>
+      <w:r>
+        <w:rPr>
+          <w:rFonts w:cs="" w:asciiTheme="minorHAnsi" w:cstheme="minorHAnsi" w:hAnsiTheme="minorHAnsi"/>
+          <w:sz w:val="20"/>
+          <w:szCs w:val="20"/>
+        </w:rPr>
+      </w:r>
+    </w:p>
+    <w:p>
+      <w:pPr>
+        <w:pStyle w:val="Normal"/>
+        <w:rPr>
+          <w:rFonts w:cs="" w:asciiTheme="minorHAnsi" w:cstheme="minorHAnsi" w:hAnsiTheme="minorHAnsi"/>
           <w:sz w:val="20"/>
           <w:szCs w:val="20"/>
         </w:rPr>
@@ -535,20 +547,24 @@
       <w:pPr>
         <w:pStyle w:val="Normal"/>
         <w:rPr>
-          <w:rFonts w:ascii="Calibri" w:hAnsi="Calibri" w:cs="Calibri" w:asciiTheme="minorHAnsi" w:cstheme="minorHAnsi" w:hAnsiTheme="minorHAnsi"/>
-          <w:sz w:val="20"/>
-          <w:szCs w:val="20"/>
-        </w:rPr>
-      </w:pPr>
-      <w:r>
-        <w:rPr/>
-      </w:r>
-    </w:p>
-    <w:p>
-      <w:pPr>
-        <w:pStyle w:val="Normal"/>
-        <w:rPr>
-          <w:rFonts w:ascii="Calibri" w:hAnsi="Calibri" w:cs="Calibri" w:asciiTheme="minorHAnsi" w:cstheme="minorHAnsi" w:hAnsiTheme="minorHAnsi"/>
+          <w:rFonts w:cs="" w:asciiTheme="minorHAnsi" w:cstheme="minorHAnsi" w:hAnsiTheme="minorHAnsi"/>
+          <w:sz w:val="20"/>
+          <w:szCs w:val="20"/>
+        </w:rPr>
+      </w:pPr>
+      <w:r>
+        <w:rPr>
+          <w:rFonts w:cs="" w:asciiTheme="minorHAnsi" w:cstheme="minorHAnsi" w:hAnsiTheme="minorHAnsi"/>
+          <w:sz w:val="20"/>
+          <w:szCs w:val="20"/>
+        </w:rPr>
+      </w:r>
+    </w:p>
+    <w:p>
+      <w:pPr>
+        <w:pStyle w:val="Normal"/>
+        <w:rPr>
+          <w:rFonts w:cs="" w:asciiTheme="minorHAnsi" w:cstheme="minorHAnsi" w:hAnsiTheme="minorHAnsi"/>
           <w:sz w:val="20"/>
           <w:szCs w:val="20"/>
         </w:rPr>
@@ -562,7 +578,7 @@
       <w:pPr>
         <w:pStyle w:val="Normal"/>
         <w:rPr>
-          <w:rFonts w:ascii="Calibri" w:hAnsi="Calibri" w:cs="Calibri" w:asciiTheme="minorHAnsi" w:cstheme="minorHAnsi" w:hAnsiTheme="minorHAnsi"/>
+          <w:rFonts w:cs="" w:asciiTheme="minorHAnsi" w:cstheme="minorHAnsi" w:hAnsiTheme="minorHAnsi"/>
           <w:sz w:val="20"/>
           <w:szCs w:val="20"/>
         </w:rPr>
@@ -576,20 +592,24 @@
       <w:pPr>
         <w:pStyle w:val="Normal"/>
         <w:rPr>
-          <w:rFonts w:ascii="Calibri" w:hAnsi="Calibri" w:cs="Calibri" w:asciiTheme="minorHAnsi" w:cstheme="minorHAnsi" w:hAnsiTheme="minorHAnsi"/>
-          <w:sz w:val="20"/>
-          <w:szCs w:val="20"/>
-        </w:rPr>
-      </w:pPr>
-      <w:r>
-        <w:rPr/>
-      </w:r>
-    </w:p>
-    <w:p>
-      <w:pPr>
-        <w:pStyle w:val="Corpsdetexte"/>
-        <w:rPr>
-          <w:rFonts w:ascii="Calibri" w:hAnsi="Calibri" w:cs="Calibri" w:asciiTheme="minorHAnsi" w:cstheme="minorHAnsi" w:hAnsiTheme="minorHAnsi"/>
+          <w:rFonts w:cs="" w:asciiTheme="minorHAnsi" w:cstheme="minorHAnsi" w:hAnsiTheme="minorHAnsi"/>
+          <w:sz w:val="20"/>
+          <w:szCs w:val="20"/>
+        </w:rPr>
+      </w:pPr>
+      <w:r>
+        <w:rPr>
+          <w:rFonts w:cs="" w:asciiTheme="minorHAnsi" w:cstheme="minorHAnsi" w:hAnsiTheme="minorHAnsi"/>
+          <w:sz w:val="20"/>
+          <w:szCs w:val="20"/>
+        </w:rPr>
+      </w:r>
+    </w:p>
+    <w:p>
+      <w:pPr>
+        <w:pStyle w:val="Corpsdetexte"/>
+        <w:rPr>
+          <w:rFonts w:cs="" w:asciiTheme="minorHAnsi" w:cstheme="minorHAnsi" w:hAnsiTheme="minorHAnsi"/>
           <w:sz w:val="20"/>
           <w:szCs w:val="20"/>
         </w:rPr>
@@ -603,7 +623,7 @@
       <w:pPr>
         <w:pStyle w:val="Corpsdetexte"/>
         <w:rPr>
-          <w:rFonts w:ascii="Calibri" w:hAnsi="Calibri" w:cs="Calibri" w:asciiTheme="minorHAnsi" w:cstheme="minorHAnsi" w:hAnsiTheme="minorHAnsi"/>
+          <w:rFonts w:cs="" w:asciiTheme="minorHAnsi" w:cstheme="minorHAnsi" w:hAnsiTheme="minorHAnsi"/>
           <w:sz w:val="20"/>
           <w:szCs w:val="20"/>
         </w:rPr>
@@ -617,7 +637,7 @@
       <w:pPr>
         <w:pStyle w:val="Corpsdetexte"/>
         <w:rPr>
-          <w:rFonts w:ascii="Calibri" w:hAnsi="Calibri" w:cs="Calibri" w:asciiTheme="minorHAnsi" w:cstheme="minorHAnsi" w:hAnsiTheme="minorHAnsi"/>
+          <w:rFonts w:cs="" w:asciiTheme="minorHAnsi" w:cstheme="minorHAnsi" w:hAnsiTheme="minorHAnsi"/>
           <w:sz w:val="20"/>
           <w:szCs w:val="20"/>
         </w:rPr>
@@ -631,29 +651,21 @@
       <w:pPr>
         <w:pStyle w:val="Corpsdetexte"/>
         <w:rPr>
-          <w:rFonts w:ascii="Calibri" w:hAnsi="Calibri" w:cs="Calibri" w:asciiTheme="minorHAnsi" w:cstheme="minorHAnsi" w:hAnsiTheme="minorHAnsi"/>
-          <w:sz w:val="20"/>
-          <w:szCs w:val="20"/>
-        </w:rPr>
-      </w:pPr>
-      <w:r>
-        <w:rPr/>
-        <w:t>Pays : {{ lieu.get_pays_etablissement_display</w:t>
-      </w:r>
-      <w:r>
-        <w:rPr/>
-        <w:t>()</w:t>
-      </w:r>
-      <w:r>
-        <w:rPr/>
-        <w:t xml:space="preserve"> or '-'  }}</w:t>
-      </w:r>
-    </w:p>
-    <w:p>
-      <w:pPr>
-        <w:pStyle w:val="Corpsdetexte"/>
-        <w:rPr>
-          <w:rFonts w:ascii="Calibri" w:hAnsi="Calibri" w:cs="Calibri" w:asciiTheme="minorHAnsi" w:cstheme="minorHAnsi" w:hAnsiTheme="minorHAnsi"/>
+          <w:rFonts w:cs="" w:asciiTheme="minorHAnsi" w:cstheme="minorHAnsi" w:hAnsiTheme="minorHAnsi"/>
+          <w:sz w:val="20"/>
+          <w:szCs w:val="20"/>
+        </w:rPr>
+      </w:pPr>
+      <w:r>
+        <w:rPr/>
+        <w:t>Pays : {{ lieu.get_pays_etablissement_display() or '-'  }}</w:t>
+      </w:r>
+    </w:p>
+    <w:p>
+      <w:pPr>
+        <w:pStyle w:val="Corpsdetexte"/>
+        <w:rPr>
+          <w:rFonts w:cs="" w:asciiTheme="minorHAnsi" w:cstheme="minorHAnsi" w:hAnsiTheme="minorHAnsi"/>
           <w:sz w:val="20"/>
           <w:szCs w:val="20"/>
         </w:rPr>
@@ -667,7 +679,7 @@
       <w:pPr>
         <w:pStyle w:val="Corpsdetexte"/>
         <w:rPr>
-          <w:rFonts w:ascii="Calibri" w:hAnsi="Calibri" w:cs="Calibri" w:asciiTheme="minorHAnsi" w:cstheme="minorHAnsi" w:hAnsiTheme="minorHAnsi"/>
+          <w:rFonts w:cs="" w:asciiTheme="minorHAnsi" w:cstheme="minorHAnsi" w:hAnsiTheme="minorHAnsi"/>
           <w:sz w:val="20"/>
           <w:szCs w:val="20"/>
         </w:rPr>
@@ -681,7 +693,7 @@
       <w:pPr>
         <w:pStyle w:val="Corpsdetexte"/>
         <w:rPr>
-          <w:rFonts w:ascii="Calibri" w:hAnsi="Calibri" w:cs="Calibri" w:asciiTheme="minorHAnsi" w:cstheme="minorHAnsi" w:hAnsiTheme="minorHAnsi"/>
+          <w:rFonts w:cs="" w:asciiTheme="minorHAnsi" w:cstheme="minorHAnsi" w:hAnsiTheme="minorHAnsi"/>
           <w:sz w:val="20"/>
           <w:szCs w:val="20"/>
         </w:rPr>
@@ -695,20 +707,24 @@
       <w:pPr>
         <w:pStyle w:val="Normal"/>
         <w:rPr>
-          <w:rFonts w:ascii="Calibri" w:hAnsi="Calibri" w:cs="Calibri" w:asciiTheme="minorHAnsi" w:cstheme="minorHAnsi" w:hAnsiTheme="minorHAnsi"/>
-          <w:sz w:val="20"/>
-          <w:szCs w:val="20"/>
-        </w:rPr>
-      </w:pPr>
-      <w:r>
-        <w:rPr/>
-      </w:r>
-    </w:p>
-    <w:p>
-      <w:pPr>
-        <w:pStyle w:val="Normal"/>
-        <w:rPr>
-          <w:rFonts w:ascii="Calibri" w:hAnsi="Calibri" w:cs="Calibri" w:asciiTheme="minorHAnsi" w:cstheme="minorHAnsi" w:hAnsiTheme="minorHAnsi"/>
+          <w:rFonts w:cs="" w:asciiTheme="minorHAnsi" w:cstheme="minorHAnsi" w:hAnsiTheme="minorHAnsi"/>
+          <w:sz w:val="20"/>
+          <w:szCs w:val="20"/>
+        </w:rPr>
+      </w:pPr>
+      <w:r>
+        <w:rPr>
+          <w:rFonts w:cs="" w:asciiTheme="minorHAnsi" w:cstheme="minorHAnsi" w:hAnsiTheme="minorHAnsi"/>
+          <w:sz w:val="20"/>
+          <w:szCs w:val="20"/>
+        </w:rPr>
+      </w:r>
+    </w:p>
+    <w:p>
+      <w:pPr>
+        <w:pStyle w:val="Normal"/>
+        <w:rPr>
+          <w:rFonts w:cs="" w:asciiTheme="minorHAnsi" w:cstheme="minorHAnsi" w:hAnsiTheme="minorHAnsi"/>
           <w:sz w:val="20"/>
           <w:szCs w:val="20"/>
         </w:rPr>
@@ -720,32 +736,55 @@
     </w:p>
     <w:p>
       <w:pPr>
+        <w:pStyle w:val="Normal"/>
+        <w:rPr>
+          <w:rFonts w:cs="" w:asciiTheme="minorHAnsi" w:cstheme="minorHAnsi" w:hAnsiTheme="minorHAnsi"/>
+          <w:sz w:val="20"/>
+          <w:szCs w:val="20"/>
+        </w:rPr>
+      </w:pPr>
+      <w:r>
+        <w:rPr>
+          <w:rFonts w:cs="" w:asciiTheme="minorHAnsi" w:cstheme="minorHAnsi" w:hAnsiTheme="minorHAnsi"/>
+          <w:sz w:val="20"/>
+          <w:szCs w:val="20"/>
+        </w:rPr>
+        <w:t>{% if not loop.last %}</w:t>
+      </w:r>
+    </w:p>
+    <w:p>
+      <w:pPr>
         <w:pStyle w:val="LigneH2"/>
         <w:rPr>
-          <w:rFonts w:ascii="Calibri" w:hAnsi="Calibri" w:cs="Calibri" w:asciiTheme="minorHAnsi" w:cstheme="minorHAnsi" w:hAnsiTheme="minorHAnsi"/>
-          <w:sz w:val="20"/>
-          <w:szCs w:val="20"/>
-        </w:rPr>
-      </w:pPr>
-      <w:r>
-        <w:rPr>
-          <w:rFonts w:cs="Calibri" w:cstheme="minorHAnsi" w:ascii="Calibri" w:hAnsi="Calibri"/>
-          <w:sz w:val="20"/>
-          <w:szCs w:val="20"/>
-        </w:rPr>
-      </w:r>
-    </w:p>
-    <w:p>
-      <w:pPr>
-        <w:pStyle w:val="Corpsdetexte"/>
-        <w:rPr>
-          <w:rFonts w:ascii="Calibri" w:hAnsi="Calibri" w:cs="Calibri" w:asciiTheme="minorHAnsi" w:cstheme="minorHAnsi" w:hAnsiTheme="minorHAnsi"/>
-          <w:sz w:val="20"/>
-          <w:szCs w:val="20"/>
-        </w:rPr>
-      </w:pPr>
-      <w:r>
-        <w:rPr/>
+          <w:rFonts w:cs="" w:asciiTheme="minorHAnsi" w:cstheme="minorHAnsi" w:hAnsiTheme="minorHAnsi"/>
+          <w:sz w:val="20"/>
+          <w:szCs w:val="20"/>
+        </w:rPr>
+      </w:pPr>
+      <w:r>
+        <w:rPr>
+          <w:rFonts w:cs="" w:asciiTheme="minorHAnsi" w:cstheme="minorHAnsi" w:hAnsiTheme="minorHAnsi"/>
+          <w:sz w:val="20"/>
+          <w:szCs w:val="20"/>
+        </w:rPr>
+      </w:r>
+    </w:p>
+    <w:p>
+      <w:pPr>
+        <w:pStyle w:val="Corpsdetexte"/>
+        <w:rPr>
+          <w:rFonts w:cs="" w:asciiTheme="minorHAnsi" w:cstheme="minorHAnsi" w:hAnsiTheme="minorHAnsi"/>
+          <w:sz w:val="20"/>
+          <w:szCs w:val="20"/>
+        </w:rPr>
+      </w:pPr>
+      <w:r>
+        <w:rPr>
+          <w:rFonts w:cs="" w:asciiTheme="minorHAnsi" w:cstheme="minorHAnsi" w:hAnsiTheme="minorHAnsi"/>
+          <w:sz w:val="20"/>
+          <w:szCs w:val="20"/>
+        </w:rPr>
+        <w:t>{% endif %}</w:t>
       </w:r>
     </w:p>
     <w:p>
@@ -764,7 +803,7 @@
       </w:pPr>
       <w:r>
         <w:rPr>
-          <w:rFonts w:cs="Calibri" w:ascii="Calibri" w:hAnsi="Calibri" w:asciiTheme="minorHAnsi" w:cstheme="minorHAnsi" w:hAnsiTheme="minorHAnsi"/>
+          <w:rFonts w:cs="" w:asciiTheme="minorHAnsi" w:cstheme="minorHAnsi" w:hAnsiTheme="minorHAnsi"/>
           <w:sz w:val="20"/>
           <w:szCs w:val="20"/>
         </w:rPr>
@@ -775,64 +814,36 @@
       <w:pPr>
         <w:pStyle w:val="Lignehorizontale"/>
         <w:rPr>
-          <w:rFonts w:ascii="Calibri" w:hAnsi="Calibri" w:cs="Calibri" w:asciiTheme="minorHAnsi" w:cstheme="minorHAnsi" w:hAnsiTheme="minorHAnsi"/>
-          <w:sz w:val="20"/>
-          <w:szCs w:val="20"/>
-        </w:rPr>
-      </w:pPr>
-      <w:r>
-        <w:rPr>
-          <w:rFonts w:cs="Calibri" w:cstheme="minorHAnsi" w:ascii="Calibri" w:hAnsi="Calibri"/>
-          <w:sz w:val="20"/>
-          <w:szCs w:val="20"/>
-        </w:rPr>
-      </w:r>
-    </w:p>
-    <w:p>
-      <w:pPr>
-        <w:pStyle w:val="Corpsdetexte"/>
-        <w:rPr>
-          <w:rFonts w:ascii="Calibri" w:hAnsi="Calibri" w:cs="Calibri" w:asciiTheme="minorHAnsi" w:cstheme="minorHAnsi" w:hAnsiTheme="minorHAnsi"/>
-          <w:sz w:val="20"/>
-          <w:szCs w:val="20"/>
-        </w:rPr>
-      </w:pPr>
-      <w:r>
-        <w:rPr/>
-        <w:t xml:space="preserve">{%p for </w:t>
-      </w:r>
-      <w:r>
-        <w:rPr/>
-        <w:t>prelevement</w:t>
-      </w:r>
-      <w:r>
-        <w:rPr/>
-        <w:t xml:space="preserve"> in </w:t>
-      </w:r>
-      <w:r>
-        <w:rPr/>
-        <w:t>li</w:t>
+          <w:rFonts w:cs="" w:asciiTheme="minorHAnsi" w:cstheme="minorHAnsi" w:hAnsiTheme="minorHAnsi"/>
+          <w:sz w:val="20"/>
+          <w:szCs w:val="20"/>
+        </w:rPr>
+      </w:pPr>
+      <w:r>
+        <w:rPr>
+          <w:rFonts w:cs="" w:asciiTheme="minorHAnsi" w:cstheme="minorHAnsi" w:hAnsiTheme="minorHAnsi"/>
+          <w:sz w:val="20"/>
+          <w:szCs w:val="20"/>
+        </w:rPr>
+      </w:r>
+    </w:p>
+    <w:p>
+      <w:pPr>
+        <w:pStyle w:val="Corpsdetexte"/>
+        <w:rPr>
+          <w:rFonts w:cs="" w:asciiTheme="minorHAnsi" w:cstheme="minorHAnsi" w:hAnsiTheme="minorHAnsi"/>
+          <w:sz w:val="20"/>
+          <w:szCs w:val="20"/>
+        </w:rPr>
+      </w:pPr>
+      <w:r>
+        <w:rPr/>
+        <w:t>{%p for prelevement in li</w:t>
       </w:r>
       <w:bookmarkStart w:id="1" w:name="__DdeLink__3196_122182529"/>
       <w:r>
         <w:rPr/>
-        <w:t>eu</w:t>
-      </w:r>
-      <w:r>
-        <w:rPr/>
-        <w:t>.</w:t>
-      </w:r>
-      <w:r>
-        <w:rPr/>
-        <w:t>prelevement</w:t>
-      </w:r>
-      <w:r>
-        <w:rPr/>
-        <w:t>s</w:t>
-      </w:r>
-      <w:r>
-        <w:rPr/>
-        <w:t>.al</w:t>
+        <w:t>eu.prelevements.al</w:t>
       </w:r>
       <w:bookmarkEnd w:id="1"/>
       <w:r>
@@ -844,7 +855,7 @@
       <w:pPr>
         <w:pStyle w:val="Corpsdetexte"/>
         <w:rPr>
-          <w:rFonts w:ascii="Calibri" w:hAnsi="Calibri" w:cs="Calibri" w:asciiTheme="minorHAnsi" w:cstheme="minorHAnsi" w:hAnsiTheme="minorHAnsi"/>
+          <w:rFonts w:cs="" w:asciiTheme="minorHAnsi" w:cstheme="minorHAnsi" w:hAnsiTheme="minorHAnsi"/>
           <w:sz w:val="20"/>
           <w:szCs w:val="20"/>
         </w:rPr>
@@ -858,7 +869,7 @@
       <w:pPr>
         <w:pStyle w:val="Corpsdetexte"/>
         <w:rPr>
-          <w:rFonts w:ascii="Calibri" w:hAnsi="Calibri" w:cs="Calibri" w:asciiTheme="minorHAnsi" w:cstheme="minorHAnsi" w:hAnsiTheme="minorHAnsi"/>
+          <w:rFonts w:cs="" w:asciiTheme="minorHAnsi" w:cstheme="minorHAnsi" w:hAnsiTheme="minorHAnsi"/>
           <w:sz w:val="20"/>
           <w:szCs w:val="20"/>
         </w:rPr>
@@ -872,7 +883,7 @@
       <w:pPr>
         <w:pStyle w:val="Corpsdetexte"/>
         <w:rPr>
-          <w:rFonts w:ascii="Calibri" w:hAnsi="Calibri" w:cs="Calibri" w:asciiTheme="minorHAnsi" w:cstheme="minorHAnsi" w:hAnsiTheme="minorHAnsi"/>
+          <w:rFonts w:cs="" w:asciiTheme="minorHAnsi" w:cstheme="minorHAnsi" w:hAnsiTheme="minorHAnsi"/>
           <w:sz w:val="20"/>
           <w:szCs w:val="20"/>
         </w:rPr>
@@ -886,7 +897,7 @@
       <w:pPr>
         <w:pStyle w:val="Corpsdetexte"/>
         <w:rPr>
-          <w:rFonts w:ascii="Calibri" w:hAnsi="Calibri" w:cs="Calibri" w:asciiTheme="minorHAnsi" w:cstheme="minorHAnsi" w:hAnsiTheme="minorHAnsi"/>
+          <w:rFonts w:cs="" w:asciiTheme="minorHAnsi" w:cstheme="minorHAnsi" w:hAnsiTheme="minorHAnsi"/>
           <w:sz w:val="20"/>
           <w:szCs w:val="20"/>
         </w:rPr>
@@ -900,7 +911,7 @@
       <w:pPr>
         <w:pStyle w:val="Corpsdetexte"/>
         <w:rPr>
-          <w:rFonts w:ascii="Calibri" w:hAnsi="Calibri" w:cs="Calibri" w:asciiTheme="minorHAnsi" w:cstheme="minorHAnsi" w:hAnsiTheme="minorHAnsi"/>
+          <w:rFonts w:cs="" w:asciiTheme="minorHAnsi" w:cstheme="minorHAnsi" w:hAnsiTheme="minorHAnsi"/>
           <w:sz w:val="20"/>
           <w:szCs w:val="20"/>
         </w:rPr>
@@ -914,51 +925,35 @@
       <w:pPr>
         <w:pStyle w:val="Corpsdetexte"/>
         <w:rPr>
-          <w:rFonts w:ascii="Calibri" w:hAnsi="Calibri" w:cs="Calibri" w:asciiTheme="minorHAnsi" w:cstheme="minorHAnsi" w:hAnsiTheme="minorHAnsi"/>
-          <w:sz w:val="20"/>
-          <w:szCs w:val="20"/>
-        </w:rPr>
-      </w:pPr>
-      <w:r>
-        <w:rPr/>
-        <w:t>Lieu : {{ prelevement.lieu.</w:t>
-      </w:r>
-      <w:r>
-        <w:rPr/>
-        <w:t xml:space="preserve">nom </w:t>
-      </w:r>
-      <w:r>
-        <w:rPr/>
-        <w:t>}}</w:t>
-      </w:r>
-    </w:p>
-    <w:p>
-      <w:pPr>
-        <w:pStyle w:val="Corpsdetexte"/>
-        <w:rPr>
-          <w:rFonts w:ascii="Calibri" w:hAnsi="Calibri" w:cs="Calibri" w:asciiTheme="minorHAnsi" w:cstheme="minorHAnsi" w:hAnsiTheme="minorHAnsi"/>
-          <w:sz w:val="20"/>
-          <w:szCs w:val="20"/>
-        </w:rPr>
-      </w:pPr>
-      <w:r>
-        <w:rPr/>
-        <w:t xml:space="preserve">Structure préleveuse : {{ </w:t>
-      </w:r>
-      <w:r>
-        <w:rPr/>
-        <w:t>prelevement</w:t>
-      </w:r>
-      <w:r>
-        <w:rPr/>
-        <w:t>.structure_preleveuse or '-'  }}</w:t>
-      </w:r>
-    </w:p>
-    <w:p>
-      <w:pPr>
-        <w:pStyle w:val="Corpsdetexte"/>
-        <w:rPr>
-          <w:rFonts w:ascii="Calibri" w:hAnsi="Calibri" w:cs="Calibri" w:asciiTheme="minorHAnsi" w:cstheme="minorHAnsi" w:hAnsiTheme="minorHAnsi"/>
+          <w:rFonts w:cs="" w:asciiTheme="minorHAnsi" w:cstheme="minorHAnsi" w:hAnsiTheme="minorHAnsi"/>
+          <w:sz w:val="20"/>
+          <w:szCs w:val="20"/>
+        </w:rPr>
+      </w:pPr>
+      <w:r>
+        <w:rPr/>
+        <w:t>Lieu : {{ prelevement.lieu.nom }}</w:t>
+      </w:r>
+    </w:p>
+    <w:p>
+      <w:pPr>
+        <w:pStyle w:val="Corpsdetexte"/>
+        <w:rPr>
+          <w:rFonts w:cs="" w:asciiTheme="minorHAnsi" w:cstheme="minorHAnsi" w:hAnsiTheme="minorHAnsi"/>
+          <w:sz w:val="20"/>
+          <w:szCs w:val="20"/>
+        </w:rPr>
+      </w:pPr>
+      <w:r>
+        <w:rPr/>
+        <w:t>Structure préleveuse : {{ prelevement.structure_preleveuse or '-'  }}</w:t>
+      </w:r>
+    </w:p>
+    <w:p>
+      <w:pPr>
+        <w:pStyle w:val="Corpsdetexte"/>
+        <w:rPr>
+          <w:rFonts w:cs="" w:asciiTheme="minorHAnsi" w:cstheme="minorHAnsi" w:hAnsiTheme="minorHAnsi"/>
           <w:sz w:val="20"/>
           <w:szCs w:val="20"/>
         </w:rPr>
@@ -972,7 +967,7 @@
       <w:pPr>
         <w:pStyle w:val="Corpsdetexte"/>
         <w:rPr>
-          <w:rFonts w:ascii="Calibri" w:hAnsi="Calibri" w:cs="Calibri" w:asciiTheme="minorHAnsi" w:cstheme="minorHAnsi" w:hAnsiTheme="minorHAnsi"/>
+          <w:rFonts w:cs="" w:asciiTheme="minorHAnsi" w:cstheme="minorHAnsi" w:hAnsiTheme="minorHAnsi"/>
           <w:sz w:val="20"/>
           <w:szCs w:val="20"/>
         </w:rPr>
@@ -986,7 +981,7 @@
       <w:pPr>
         <w:pStyle w:val="Corpsdetexte"/>
         <w:rPr>
-          <w:rFonts w:ascii="Calibri" w:hAnsi="Calibri" w:cs="Calibri" w:asciiTheme="minorHAnsi" w:cstheme="minorHAnsi" w:hAnsiTheme="minorHAnsi"/>
+          <w:rFonts w:cs="" w:asciiTheme="minorHAnsi" w:cstheme="minorHAnsi" w:hAnsiTheme="minorHAnsi"/>
           <w:sz w:val="20"/>
           <w:szCs w:val="20"/>
         </w:rPr>
@@ -1000,7 +995,7 @@
       <w:pPr>
         <w:pStyle w:val="Corpsdetexte"/>
         <w:rPr>
-          <w:rFonts w:ascii="Calibri" w:hAnsi="Calibri" w:cs="Calibri" w:asciiTheme="minorHAnsi" w:cstheme="minorHAnsi" w:hAnsiTheme="minorHAnsi"/>
+          <w:rFonts w:cs="" w:asciiTheme="minorHAnsi" w:cstheme="minorHAnsi" w:hAnsiTheme="minorHAnsi"/>
           <w:sz w:val="20"/>
           <w:szCs w:val="20"/>
         </w:rPr>
@@ -1014,7 +1009,7 @@
       <w:pPr>
         <w:pStyle w:val="Corpsdetexte"/>
         <w:rPr>
-          <w:rFonts w:ascii="Calibri" w:hAnsi="Calibri" w:cs="Calibri" w:asciiTheme="minorHAnsi" w:cstheme="minorHAnsi" w:hAnsiTheme="minorHAnsi"/>
+          <w:rFonts w:cs="" w:asciiTheme="minorHAnsi" w:cstheme="minorHAnsi" w:hAnsiTheme="minorHAnsi"/>
           <w:sz w:val="20"/>
           <w:szCs w:val="20"/>
         </w:rPr>
@@ -1028,7 +1023,7 @@
       <w:pPr>
         <w:pStyle w:val="Corpsdetexte"/>
         <w:rPr>
-          <w:rFonts w:ascii="Calibri" w:hAnsi="Calibri" w:cs="Calibri" w:asciiTheme="minorHAnsi" w:cstheme="minorHAnsi" w:hAnsiTheme="minorHAnsi"/>
+          <w:rFonts w:cs="" w:asciiTheme="minorHAnsi" w:cstheme="minorHAnsi" w:hAnsiTheme="minorHAnsi"/>
           <w:sz w:val="20"/>
           <w:szCs w:val="20"/>
         </w:rPr>
@@ -1042,7 +1037,7 @@
       <w:pPr>
         <w:pStyle w:val="Corpsdetexte"/>
         <w:rPr>
-          <w:rFonts w:ascii="Calibri" w:hAnsi="Calibri" w:cs="Calibri" w:asciiTheme="minorHAnsi" w:cstheme="minorHAnsi" w:hAnsiTheme="minorHAnsi"/>
+          <w:rFonts w:cs="" w:asciiTheme="minorHAnsi" w:cstheme="minorHAnsi" w:hAnsiTheme="minorHAnsi"/>
           <w:sz w:val="20"/>
           <w:szCs w:val="20"/>
         </w:rPr>
@@ -1054,26 +1049,44 @@
     </w:p>
     <w:p>
       <w:pPr>
+        <w:pStyle w:val="Normal"/>
+        <w:rPr>
+          <w:rFonts w:cs="" w:asciiTheme="minorHAnsi" w:cstheme="minorHAnsi" w:hAnsiTheme="minorHAnsi"/>
+          <w:sz w:val="20"/>
+          <w:szCs w:val="20"/>
+        </w:rPr>
+      </w:pPr>
+      <w:r>
+        <w:rPr>
+          <w:rFonts w:cs="" w:asciiTheme="minorHAnsi" w:cstheme="minorHAnsi" w:hAnsiTheme="minorHAnsi"/>
+          <w:sz w:val="20"/>
+          <w:szCs w:val="20"/>
+        </w:rPr>
+        <w:t>{% if not loop.last %}</w:t>
+      </w:r>
+    </w:p>
+    <w:p>
+      <w:pPr>
         <w:pStyle w:val="LigneH2"/>
         <w:rPr>
-          <w:rFonts w:ascii="Calibri" w:hAnsi="Calibri" w:cs="Calibri" w:asciiTheme="minorHAnsi" w:cstheme="minorHAnsi" w:hAnsiTheme="minorHAnsi"/>
-          <w:sz w:val="20"/>
-          <w:szCs w:val="20"/>
-        </w:rPr>
-      </w:pPr>
-      <w:r>
-        <w:rPr>
-          <w:rFonts w:cs="Calibri" w:cstheme="minorHAnsi" w:ascii="Calibri" w:hAnsi="Calibri"/>
-          <w:sz w:val="20"/>
-          <w:szCs w:val="20"/>
-        </w:rPr>
-      </w:r>
-    </w:p>
-    <w:p>
-      <w:pPr>
-        <w:pStyle w:val="Corpsdetexte"/>
-        <w:rPr>
-          <w:rFonts w:ascii="Calibri" w:hAnsi="Calibri" w:cs="Calibri" w:asciiTheme="minorHAnsi" w:cstheme="minorHAnsi" w:hAnsiTheme="minorHAnsi"/>
+          <w:rFonts w:cs="" w:asciiTheme="minorHAnsi" w:cstheme="minorHAnsi" w:hAnsiTheme="minorHAnsi"/>
+          <w:sz w:val="20"/>
+          <w:szCs w:val="20"/>
+        </w:rPr>
+      </w:pPr>
+      <w:r>
+        <w:rPr>
+          <w:rFonts w:cs="" w:asciiTheme="minorHAnsi" w:cstheme="minorHAnsi" w:hAnsiTheme="minorHAnsi"/>
+          <w:sz w:val="20"/>
+          <w:szCs w:val="20"/>
+        </w:rPr>
+      </w:r>
+    </w:p>
+    <w:p>
+      <w:pPr>
+        <w:pStyle w:val="Corpsdetexte"/>
+        <w:rPr>
+          <w:rFonts w:cs="" w:asciiTheme="minorHAnsi" w:cstheme="minorHAnsi" w:hAnsiTheme="minorHAnsi"/>
           <w:sz w:val="20"/>
           <w:szCs w:val="20"/>
         </w:rPr>
@@ -1081,21 +1094,21 @@
       <w:r>
         <w:rPr>
           <w:rStyle w:val="Citation"/>
-          <w:rFonts w:eastAsia="Noto Serif CJK SC" w:cs="Calibri" w:ascii="Calibri" w:hAnsi="Calibri" w:asciiTheme="minorHAnsi" w:cstheme="minorHAnsi" w:hAnsiTheme="minorHAnsi"/>
+          <w:rFonts w:eastAsia="Noto Serif CJK SC" w:cs="" w:asciiTheme="minorHAnsi" w:cstheme="minorHAnsi" w:hAnsiTheme="minorHAnsi"/>
           <w:color w:val="auto"/>
           <w:kern w:val="2"/>
           <w:sz w:val="20"/>
           <w:szCs w:val="20"/>
           <w:lang w:val="fr-FR" w:eastAsia="zh-CN" w:bidi="hi-IN"/>
         </w:rPr>
-        <w:t>{%p endfor %}</w:t>
-      </w:r>
-    </w:p>
-    <w:p>
-      <w:pPr>
-        <w:pStyle w:val="Corpsdetexte"/>
-        <w:rPr>
-          <w:rFonts w:ascii="Calibri" w:hAnsi="Calibri" w:cs="Calibri" w:asciiTheme="minorHAnsi" w:cstheme="minorHAnsi" w:hAnsiTheme="minorHAnsi"/>
+        <w:t>{% endif %}</w:t>
+      </w:r>
+    </w:p>
+    <w:p>
+      <w:pPr>
+        <w:pStyle w:val="Corpsdetexte"/>
+        <w:rPr>
+          <w:rFonts w:cs="" w:asciiTheme="minorHAnsi" w:cstheme="minorHAnsi" w:hAnsiTheme="minorHAnsi"/>
           <w:sz w:val="20"/>
           <w:szCs w:val="20"/>
         </w:rPr>
@@ -1103,7 +1116,7 @@
       <w:r>
         <w:rPr>
           <w:rStyle w:val="Citation"/>
-          <w:rFonts w:eastAsia="Noto Serif CJK SC" w:cs="Calibri" w:ascii="Calibri" w:hAnsi="Calibri" w:asciiTheme="minorHAnsi" w:cstheme="minorHAnsi" w:hAnsiTheme="minorHAnsi"/>
+          <w:rFonts w:eastAsia="Noto Serif CJK SC" w:cs="" w:asciiTheme="minorHAnsi" w:cstheme="minorHAnsi" w:hAnsiTheme="minorHAnsi"/>
           <w:color w:val="auto"/>
           <w:kern w:val="2"/>
           <w:sz w:val="20"/>
@@ -1117,26 +1130,56 @@
       <w:pPr>
         <w:pStyle w:val="Corpsdetexte"/>
         <w:rPr>
-          <w:rFonts w:ascii="Calibri" w:hAnsi="Calibri" w:cs="Calibri" w:asciiTheme="minorHAnsi" w:cstheme="minorHAnsi" w:hAnsiTheme="minorHAnsi"/>
-          <w:sz w:val="20"/>
-          <w:szCs w:val="20"/>
-        </w:rPr>
-      </w:pPr>
-      <w:r>
-        <w:rPr/>
-      </w:r>
-    </w:p>
-    <w:p>
-      <w:pPr>
-        <w:pStyle w:val="Corpsdetexte"/>
-        <w:rPr>
-          <w:rFonts w:ascii="Calibri" w:hAnsi="Calibri" w:cs="Calibri" w:asciiTheme="minorHAnsi" w:cstheme="minorHAnsi" w:hAnsiTheme="minorHAnsi"/>
-          <w:sz w:val="20"/>
-          <w:szCs w:val="20"/>
-        </w:rPr>
-      </w:pPr>
-      <w:r>
-        <w:rPr/>
+          <w:rFonts w:cs="" w:asciiTheme="minorHAnsi" w:cstheme="minorHAnsi" w:hAnsiTheme="minorHAnsi"/>
+          <w:sz w:val="20"/>
+          <w:szCs w:val="20"/>
+        </w:rPr>
+      </w:pPr>
+      <w:r>
+        <w:rPr>
+          <w:rStyle w:val="Citation"/>
+          <w:rFonts w:eastAsia="Noto Serif CJK SC" w:cs="" w:asciiTheme="minorHAnsi" w:cstheme="minorHAnsi" w:hAnsiTheme="minorHAnsi"/>
+          <w:color w:val="auto"/>
+          <w:kern w:val="2"/>
+          <w:sz w:val="20"/>
+          <w:szCs w:val="20"/>
+          <w:lang w:val="fr-FR" w:eastAsia="zh-CN" w:bidi="hi-IN"/>
+        </w:rPr>
+        <w:t>{%p endfor %}</w:t>
+      </w:r>
+    </w:p>
+    <w:p>
+      <w:pPr>
+        <w:pStyle w:val="Corpsdetexte"/>
+        <w:rPr>
+          <w:rFonts w:cs="" w:asciiTheme="minorHAnsi" w:cstheme="minorHAnsi" w:hAnsiTheme="minorHAnsi"/>
+          <w:sz w:val="20"/>
+          <w:szCs w:val="20"/>
+        </w:rPr>
+      </w:pPr>
+      <w:r>
+        <w:rPr>
+          <w:rFonts w:cs="" w:asciiTheme="minorHAnsi" w:cstheme="minorHAnsi" w:hAnsiTheme="minorHAnsi"/>
+          <w:sz w:val="20"/>
+          <w:szCs w:val="20"/>
+        </w:rPr>
+      </w:r>
+    </w:p>
+    <w:p>
+      <w:pPr>
+        <w:pStyle w:val="Corpsdetexte"/>
+        <w:rPr>
+          <w:rFonts w:cs="" w:asciiTheme="minorHAnsi" w:cstheme="minorHAnsi" w:hAnsiTheme="minorHAnsi"/>
+          <w:sz w:val="20"/>
+          <w:szCs w:val="20"/>
+        </w:rPr>
+      </w:pPr>
+      <w:r>
+        <w:rPr>
+          <w:rFonts w:cs="" w:asciiTheme="minorHAnsi" w:cstheme="minorHAnsi" w:hAnsiTheme="minorHAnsi"/>
+          <w:sz w:val="20"/>
+          <w:szCs w:val="20"/>
+        </w:rPr>
       </w:r>
     </w:p>
     <w:p>
@@ -1181,26 +1224,29 @@
     <w:p>
       <w:pPr>
         <w:pStyle w:val="Corpsdetexte"/>
-        <w:rPr>
-          <w:rFonts w:ascii="Calibri" w:hAnsi="Calibri" w:cs="Calibri" w:asciiTheme="minorHAnsi" w:cstheme="minorHAnsi" w:hAnsiTheme="minorHAnsi"/>
-          <w:sz w:val="20"/>
-          <w:szCs w:val="20"/>
-        </w:rPr>
+        <w:rPr/>
       </w:pPr>
       <w:r>
         <w:rPr>
           <w:rStyle w:val="Citation"/>
+          <w:i w:val="false"/>
+          <w:iCs w:val="false"/>
           <w:lang w:val="fr-FR" w:eastAsia="zh-CN" w:bidi="hi-IN"/>
         </w:rPr>
         <w:t>Mesures conservatoires imm</w:t>
       </w:r>
       <w:r>
-        <w:rPr/>
+        <w:rPr>
+          <w:i w:val="false"/>
+          <w:iCs w:val="false"/>
+        </w:rPr>
         <w:t>édiates</w:t>
       </w:r>
       <w:r>
         <w:rPr>
           <w:rStyle w:val="Citation"/>
+          <w:i w:val="false"/>
+          <w:iCs w:val="false"/>
           <w:lang w:val="fr-FR" w:eastAsia="zh-CN" w:bidi="hi-IN"/>
         </w:rPr>
         <w:t> : {{ object.mesures_conservatoires_immediates or '-'  }}</w:t>
@@ -1209,15 +1255,13 @@
     <w:p>
       <w:pPr>
         <w:pStyle w:val="Corpsdetexte"/>
-        <w:rPr>
-          <w:rFonts w:ascii="Calibri" w:hAnsi="Calibri" w:cs="Calibri" w:asciiTheme="minorHAnsi" w:cstheme="minorHAnsi" w:hAnsiTheme="minorHAnsi"/>
-          <w:sz w:val="20"/>
-          <w:szCs w:val="20"/>
-        </w:rPr>
+        <w:rPr/>
       </w:pPr>
       <w:r>
         <w:rPr>
           <w:rStyle w:val="Citation"/>
+          <w:i w:val="false"/>
+          <w:iCs w:val="false"/>
         </w:rPr>
         <w:t>Mesures de consignation : {{ object.mesures_consignation or '-'  }}</w:t>
       </w:r>
@@ -1225,15 +1269,13 @@
     <w:p>
       <w:pPr>
         <w:pStyle w:val="Corpsdetexte"/>
-        <w:rPr>
-          <w:rFonts w:ascii="Calibri" w:hAnsi="Calibri" w:cs="Calibri" w:asciiTheme="minorHAnsi" w:cstheme="minorHAnsi" w:hAnsiTheme="minorHAnsi"/>
-          <w:sz w:val="20"/>
-          <w:szCs w:val="20"/>
-        </w:rPr>
+        <w:rPr/>
       </w:pPr>
       <w:r>
         <w:rPr>
           <w:rStyle w:val="Citation"/>
+          <w:i w:val="false"/>
+          <w:iCs w:val="false"/>
         </w:rPr>
         <w:t>Mesures phytosanitaires : {{ object.mesures_phytosanitaires or '-'  }}</w:t>
       </w:r>
@@ -1241,21 +1283,22 @@
     <w:p>
       <w:pPr>
         <w:pStyle w:val="Corpsdetexte"/>
-        <w:rPr>
-          <w:rFonts w:ascii="Calibri" w:hAnsi="Calibri" w:cs="Calibri" w:asciiTheme="minorHAnsi" w:cstheme="minorHAnsi" w:hAnsiTheme="minorHAnsi"/>
-          <w:sz w:val="20"/>
-          <w:szCs w:val="20"/>
-        </w:rPr>
+        <w:rPr/>
       </w:pPr>
       <w:r>
         <w:rPr>
           <w:rStyle w:val="Citation"/>
+          <w:i w:val="false"/>
+          <w:iCs w:val="false"/>
           <w:lang w:val="fr-FR" w:eastAsia="zh-CN" w:bidi="hi-IN"/>
         </w:rPr>
         <w:t>Mesures de surveillance sp</w:t>
       </w:r>
       <w:r>
-        <w:rPr/>
+        <w:rPr>
+          <w:i w:val="false"/>
+          <w:iCs w:val="false"/>
+        </w:rPr>
         <w:t>écifique : {{ object.mesures_surveillance_specifique or '-'  }}</w:t>
       </w:r>
     </w:p>
@@ -1265,16 +1308,14 @@
         <w:bidi w:val="0"/>
         <w:spacing w:before="0" w:after="140"/>
         <w:jc w:val="left"/>
-        <w:rPr>
-          <w:rFonts w:ascii="Calibri" w:hAnsi="Calibri" w:cs="Calibri" w:asciiTheme="minorHAnsi" w:cstheme="minorHAnsi" w:hAnsiTheme="minorHAnsi"/>
-          <w:sz w:val="20"/>
-          <w:szCs w:val="20"/>
-        </w:rPr>
+        <w:rPr/>
       </w:pPr>
       <w:r>
         <w:rPr>
           <w:rStyle w:val="Citation"/>
-          <w:rFonts w:eastAsia="Noto Serif CJK SC" w:cs="Calibri" w:ascii="Calibri" w:hAnsi="Calibri" w:asciiTheme="minorHAnsi" w:cstheme="minorHAnsi" w:hAnsiTheme="minorHAnsi"/>
+          <w:rFonts w:eastAsia="Noto Serif CJK SC" w:cs="" w:asciiTheme="minorHAnsi" w:cstheme="minorHAnsi" w:hAnsiTheme="minorHAnsi"/>
+          <w:i w:val="false"/>
+          <w:iCs w:val="false"/>
           <w:color w:val="auto"/>
           <w:kern w:val="2"/>
           <w:sz w:val="20"/>
@@ -1315,7 +1356,6 @@
     </w:lvl>
     <w:lvl w:ilvl="1">
       <w:start w:val="1"/>
-      <w:pStyle w:val="Titre2"/>
       <w:numFmt w:val="none"/>
       <w:suff w:val="nothing"/>
       <w:lvlText w:val=""/>

</xml_diff>

<commit_message>
feat(SV): SiteInspection renames and grouping
</commit_message>
<xml_diff>
--- a/sv/doc_templates/detection.docx
+++ b/sv/doc_templates/detection.docx
@@ -35,14 +35,14 @@
         </w:numPr>
         <w:jc w:val="center"/>
         <w:rPr>
-          <w:rFonts w:cs="" w:asciiTheme="minorHAnsi" w:cstheme="minorHAnsi" w:hAnsiTheme="minorHAnsi"/>
+          <w:rFonts w:ascii="Arial" w:hAnsi="Arial" w:cs="Arial" w:asciiTheme="minorHAnsi" w:cstheme="minorHAnsi" w:hAnsiTheme="minorHAnsi"/>
           <w:sz w:val="24"/>
           <w:szCs w:val="24"/>
         </w:rPr>
       </w:pPr>
       <w:r>
         <w:rPr>
-          <w:rFonts w:cs="" w:asciiTheme="minorHAnsi" w:cstheme="minorHAnsi" w:hAnsiTheme="minorHAnsi"/>
+          <w:rFonts w:cs="Arial" w:cstheme="minorHAnsi" w:ascii="Arial" w:hAnsi="Arial"/>
           <w:sz w:val="24"/>
           <w:szCs w:val="24"/>
         </w:rPr>
@@ -57,14 +57,14 @@
         </w:numPr>
         <w:jc w:val="center"/>
         <w:rPr>
-          <w:rFonts w:cs="" w:asciiTheme="minorHAnsi" w:cstheme="minorHAnsi" w:hAnsiTheme="minorHAnsi"/>
+          <w:rFonts w:ascii="Arial" w:hAnsi="Arial" w:cs="Arial" w:asciiTheme="minorHAnsi" w:cstheme="minorHAnsi" w:hAnsiTheme="minorHAnsi"/>
           <w:sz w:val="24"/>
           <w:szCs w:val="24"/>
         </w:rPr>
       </w:pPr>
       <w:r>
         <w:rPr>
-          <w:rFonts w:cs="" w:asciiTheme="minorHAnsi" w:cstheme="minorHAnsi" w:hAnsiTheme="minorHAnsi"/>
+          <w:rFonts w:cs="Arial" w:ascii="Arial" w:hAnsi="Arial" w:asciiTheme="minorHAnsi" w:cstheme="minorHAnsi" w:hAnsiTheme="minorHAnsi"/>
           <w:sz w:val="24"/>
           <w:szCs w:val="24"/>
         </w:rPr>
@@ -76,14 +76,14 @@
         <w:pStyle w:val="BodyText"/>
         <w:jc w:val="center"/>
         <w:rPr>
-          <w:rFonts w:cs="" w:asciiTheme="minorHAnsi" w:cstheme="minorHAnsi" w:hAnsiTheme="minorHAnsi"/>
+          <w:rFonts w:ascii="Arial" w:hAnsi="Arial" w:cs="Arial" w:asciiTheme="minorHAnsi" w:cstheme="minorHAnsi" w:hAnsiTheme="minorHAnsi"/>
           <w:sz w:val="24"/>
           <w:szCs w:val="24"/>
         </w:rPr>
       </w:pPr>
       <w:r>
         <w:rPr>
-          <w:rFonts w:cs="" w:asciiTheme="minorHAnsi" w:cstheme="minorHAnsi" w:hAnsiTheme="minorHAnsi"/>
+          <w:rFonts w:cs="Arial" w:cstheme="minorHAnsi" w:ascii="Arial" w:hAnsi="Arial"/>
           <w:sz w:val="24"/>
           <w:szCs w:val="24"/>
         </w:rPr>
@@ -114,7 +114,7 @@
     </w:p>
     <w:p>
       <w:pPr>
-        <w:pStyle w:val="Lignehorizontaleuser"/>
+        <w:pStyle w:val="Lignehorizontale"/>
         <w:suppressLineNumbers/>
         <w:pBdr>
           <w:bottom w:val="double" w:sz="2" w:space="0" w:color="808080"/>
@@ -192,7 +192,7 @@
     </w:p>
     <w:p>
       <w:pPr>
-        <w:pStyle w:val="Lignehorizontaleuser"/>
+        <w:pStyle w:val="Lignehorizontale"/>
         <w:suppressLineNumbers/>
         <w:pBdr>
           <w:bottom w:val="double" w:sz="2" w:space="0" w:color="808080"/>
@@ -227,7 +227,7 @@
       </w:r>
       <w:r>
         <w:rPr>
-          <w:rFonts w:cs="" w:asciiTheme="minorHAnsi" w:cstheme="minorHAnsi" w:hAnsiTheme="minorHAnsi"/>
+          <w:rFonts w:cs="Arial" w:ascii="Arial" w:hAnsi="Arial" w:asciiTheme="minorHAnsi" w:cstheme="minorHAnsi" w:hAnsiTheme="minorHAnsi"/>
           <w:sz w:val="20"/>
           <w:szCs w:val="20"/>
         </w:rPr>
@@ -239,7 +239,7 @@
       </w:r>
       <w:r>
         <w:rPr>
-          <w:rFonts w:cs="" w:asciiTheme="minorHAnsi" w:cstheme="minorHAnsi" w:hAnsiTheme="minorHAnsi"/>
+          <w:rFonts w:cs="Arial" w:ascii="Arial" w:hAnsi="Arial" w:asciiTheme="minorHAnsi" w:cstheme="minorHAnsi" w:hAnsiTheme="minorHAnsi"/>
           <w:sz w:val="20"/>
           <w:szCs w:val="20"/>
         </w:rPr>
@@ -291,7 +291,7 @@
       </w:pPr>
       <w:r>
         <w:rPr>
-          <w:rFonts w:cs="" w:asciiTheme="minorHAnsi" w:cstheme="minorHAnsi" w:hAnsiTheme="minorHAnsi"/>
+          <w:rFonts w:cs="Arial" w:ascii="Arial" w:hAnsi="Arial" w:asciiTheme="minorHAnsi" w:cstheme="minorHAnsi" w:hAnsiTheme="minorHAnsi"/>
           <w:sz w:val="20"/>
           <w:szCs w:val="20"/>
         </w:rPr>
@@ -300,26 +300,26 @@
     </w:p>
     <w:p>
       <w:pPr>
-        <w:pStyle w:val="Lignehorizontaleuser"/>
-        <w:rPr>
-          <w:rFonts w:cs="" w:asciiTheme="minorHAnsi" w:cstheme="minorHAnsi" w:hAnsiTheme="minorHAnsi"/>
-          <w:sz w:val="20"/>
-          <w:szCs w:val="20"/>
-        </w:rPr>
-      </w:pPr>
-      <w:r>
-        <w:rPr>
-          <w:rFonts w:cs="" w:asciiTheme="minorHAnsi" w:cstheme="minorHAnsi" w:hAnsiTheme="minorHAnsi"/>
-          <w:sz w:val="20"/>
-          <w:szCs w:val="20"/>
-        </w:rPr>
-      </w:r>
-    </w:p>
-    <w:p>
-      <w:pPr>
-        <w:pStyle w:val="BodyText"/>
-        <w:rPr>
-          <w:rFonts w:cs="" w:asciiTheme="minorHAnsi" w:cstheme="minorHAnsi" w:hAnsiTheme="minorHAnsi"/>
+        <w:pStyle w:val="Lignehorizontale"/>
+        <w:rPr>
+          <w:rFonts w:ascii="Arial" w:hAnsi="Arial" w:cs="Arial" w:asciiTheme="minorHAnsi" w:cstheme="minorHAnsi" w:hAnsiTheme="minorHAnsi"/>
+          <w:sz w:val="20"/>
+          <w:szCs w:val="20"/>
+        </w:rPr>
+      </w:pPr>
+      <w:r>
+        <w:rPr>
+          <w:rFonts w:cs="Arial" w:cstheme="minorHAnsi" w:ascii="Arial" w:hAnsi="Arial"/>
+          <w:sz w:val="20"/>
+          <w:szCs w:val="20"/>
+        </w:rPr>
+      </w:r>
+    </w:p>
+    <w:p>
+      <w:pPr>
+        <w:pStyle w:val="BodyText"/>
+        <w:rPr>
+          <w:rFonts w:ascii="Arial" w:hAnsi="Arial" w:cs="Arial" w:asciiTheme="minorHAnsi" w:cstheme="minorHAnsi" w:hAnsiTheme="minorHAnsi"/>
           <w:sz w:val="20"/>
           <w:szCs w:val="20"/>
         </w:rPr>
@@ -333,7 +333,7 @@
       <w:pPr>
         <w:pStyle w:val="BodyText"/>
         <w:rPr>
-          <w:rFonts w:cs="" w:asciiTheme="minorHAnsi" w:cstheme="minorHAnsi" w:hAnsiTheme="minorHAnsi"/>
+          <w:rFonts w:ascii="Arial" w:hAnsi="Arial" w:cs="Arial" w:asciiTheme="minorHAnsi" w:cstheme="minorHAnsi" w:hAnsiTheme="minorHAnsi"/>
           <w:sz w:val="20"/>
           <w:szCs w:val="20"/>
         </w:rPr>
@@ -347,7 +347,7 @@
       <w:pPr>
         <w:pStyle w:val="Normal"/>
         <w:rPr>
-          <w:rFonts w:cs="" w:asciiTheme="minorHAnsi" w:cstheme="minorHAnsi" w:hAnsiTheme="minorHAnsi"/>
+          <w:rFonts w:ascii="Arial" w:hAnsi="Arial" w:cs="Arial" w:asciiTheme="minorHAnsi" w:cstheme="minorHAnsi" w:hAnsiTheme="minorHAnsi"/>
           <w:sz w:val="20"/>
           <w:szCs w:val="20"/>
         </w:rPr>
@@ -361,24 +361,24 @@
       <w:pPr>
         <w:pStyle w:val="Normal"/>
         <w:rPr>
-          <w:rFonts w:cs="" w:asciiTheme="minorHAnsi" w:cstheme="minorHAnsi" w:hAnsiTheme="minorHAnsi"/>
-          <w:sz w:val="20"/>
-          <w:szCs w:val="20"/>
-        </w:rPr>
-      </w:pPr>
-      <w:r>
-        <w:rPr>
-          <w:rFonts w:cs="" w:asciiTheme="minorHAnsi" w:cstheme="minorHAnsi" w:hAnsiTheme="minorHAnsi"/>
-          <w:sz w:val="20"/>
-          <w:szCs w:val="20"/>
-        </w:rPr>
-      </w:r>
-    </w:p>
-    <w:p>
-      <w:pPr>
-        <w:pStyle w:val="Normal"/>
-        <w:rPr>
-          <w:rFonts w:cs="" w:asciiTheme="minorHAnsi" w:cstheme="minorHAnsi" w:hAnsiTheme="minorHAnsi"/>
+          <w:rFonts w:ascii="Arial" w:hAnsi="Arial" w:cs="Arial" w:asciiTheme="minorHAnsi" w:cstheme="minorHAnsi" w:hAnsiTheme="minorHAnsi"/>
+          <w:sz w:val="20"/>
+          <w:szCs w:val="20"/>
+        </w:rPr>
+      </w:pPr>
+      <w:r>
+        <w:rPr>
+          <w:rFonts w:cs="Arial" w:cstheme="minorHAnsi" w:ascii="Arial" w:hAnsi="Arial"/>
+          <w:sz w:val="20"/>
+          <w:szCs w:val="20"/>
+        </w:rPr>
+      </w:r>
+    </w:p>
+    <w:p>
+      <w:pPr>
+        <w:pStyle w:val="Normal"/>
+        <w:rPr>
+          <w:rFonts w:ascii="Arial" w:hAnsi="Arial" w:cs="Arial" w:asciiTheme="minorHAnsi" w:cstheme="minorHAnsi" w:hAnsiTheme="minorHAnsi"/>
           <w:sz w:val="20"/>
           <w:szCs w:val="20"/>
         </w:rPr>
@@ -392,55 +392,55 @@
       <w:pPr>
         <w:pStyle w:val="Normal"/>
         <w:rPr>
-          <w:rFonts w:cs="" w:asciiTheme="minorHAnsi" w:cstheme="minorHAnsi" w:hAnsiTheme="minorHAnsi"/>
-          <w:sz w:val="20"/>
-          <w:szCs w:val="20"/>
-        </w:rPr>
-      </w:pPr>
-      <w:r>
-        <w:rPr>
-          <w:rFonts w:cs="" w:asciiTheme="minorHAnsi" w:cstheme="minorHAnsi" w:hAnsiTheme="minorHAnsi"/>
-          <w:sz w:val="20"/>
-          <w:szCs w:val="20"/>
-        </w:rPr>
-      </w:r>
-    </w:p>
-    <w:p>
-      <w:pPr>
-        <w:pStyle w:val="Normal"/>
-        <w:rPr>
-          <w:rFonts w:cs="" w:asciiTheme="minorHAnsi" w:cstheme="minorHAnsi" w:hAnsiTheme="minorHAnsi"/>
-          <w:sz w:val="20"/>
-          <w:szCs w:val="20"/>
-        </w:rPr>
-      </w:pPr>
-      <w:r>
-        <w:rPr/>
-        <w:t>Site d'inspection : {{ lieu.site_inspection.nom or '-'  }}</w:t>
-      </w:r>
-    </w:p>
-    <w:p>
-      <w:pPr>
-        <w:pStyle w:val="Normal"/>
-        <w:rPr>
-          <w:rFonts w:cs="" w:asciiTheme="minorHAnsi" w:cstheme="minorHAnsi" w:hAnsiTheme="minorHAnsi"/>
-          <w:sz w:val="20"/>
-          <w:szCs w:val="20"/>
-        </w:rPr>
-      </w:pPr>
-      <w:r>
-        <w:rPr>
-          <w:rFonts w:cs="" w:asciiTheme="minorHAnsi" w:cstheme="minorHAnsi" w:hAnsiTheme="minorHAnsi"/>
-          <w:sz w:val="20"/>
-          <w:szCs w:val="20"/>
-        </w:rPr>
-      </w:r>
-    </w:p>
-    <w:p>
-      <w:pPr>
-        <w:pStyle w:val="Normal"/>
-        <w:rPr>
-          <w:rFonts w:cs="" w:asciiTheme="minorHAnsi" w:cstheme="minorHAnsi" w:hAnsiTheme="minorHAnsi"/>
+          <w:rFonts w:ascii="Arial" w:hAnsi="Arial" w:cs="Arial" w:asciiTheme="minorHAnsi" w:cstheme="minorHAnsi" w:hAnsiTheme="minorHAnsi"/>
+          <w:sz w:val="20"/>
+          <w:szCs w:val="20"/>
+        </w:rPr>
+      </w:pPr>
+      <w:r>
+        <w:rPr>
+          <w:rFonts w:cs="Arial" w:cstheme="minorHAnsi" w:ascii="Arial" w:hAnsi="Arial"/>
+          <w:sz w:val="20"/>
+          <w:szCs w:val="20"/>
+        </w:rPr>
+      </w:r>
+    </w:p>
+    <w:p>
+      <w:pPr>
+        <w:pStyle w:val="Normal"/>
+        <w:rPr>
+          <w:rFonts w:ascii="Arial" w:hAnsi="Arial" w:cs="Arial" w:asciiTheme="minorHAnsi" w:cstheme="minorHAnsi" w:hAnsiTheme="minorHAnsi"/>
+          <w:sz w:val="20"/>
+          <w:szCs w:val="20"/>
+        </w:rPr>
+      </w:pPr>
+      <w:r>
+        <w:rPr/>
+        <w:t>Site d'inspection : {{ lieu.grouped_site_inspection or '-'  }}</w:t>
+      </w:r>
+    </w:p>
+    <w:p>
+      <w:pPr>
+        <w:pStyle w:val="Normal"/>
+        <w:rPr>
+          <w:rFonts w:ascii="Arial" w:hAnsi="Arial" w:cs="Arial" w:asciiTheme="minorHAnsi" w:cstheme="minorHAnsi" w:hAnsiTheme="minorHAnsi"/>
+          <w:sz w:val="20"/>
+          <w:szCs w:val="20"/>
+        </w:rPr>
+      </w:pPr>
+      <w:r>
+        <w:rPr>
+          <w:rFonts w:cs="Arial" w:cstheme="minorHAnsi" w:ascii="Arial" w:hAnsi="Arial"/>
+          <w:sz w:val="20"/>
+          <w:szCs w:val="20"/>
+        </w:rPr>
+      </w:r>
+    </w:p>
+    <w:p>
+      <w:pPr>
+        <w:pStyle w:val="Normal"/>
+        <w:rPr>
+          <w:rFonts w:ascii="Arial" w:hAnsi="Arial" w:cs="Arial" w:asciiTheme="minorHAnsi" w:cstheme="minorHAnsi" w:hAnsiTheme="minorHAnsi"/>
           <w:sz w:val="20"/>
           <w:szCs w:val="20"/>
         </w:rPr>
@@ -454,24 +454,24 @@
       <w:pPr>
         <w:pStyle w:val="Normal"/>
         <w:rPr>
-          <w:rFonts w:cs="" w:asciiTheme="minorHAnsi" w:cstheme="minorHAnsi" w:hAnsiTheme="minorHAnsi"/>
-          <w:sz w:val="20"/>
-          <w:szCs w:val="20"/>
-        </w:rPr>
-      </w:pPr>
-      <w:r>
-        <w:rPr>
-          <w:rFonts w:cs="" w:asciiTheme="minorHAnsi" w:cstheme="minorHAnsi" w:hAnsiTheme="minorHAnsi"/>
-          <w:sz w:val="20"/>
-          <w:szCs w:val="20"/>
-        </w:rPr>
-      </w:r>
-    </w:p>
-    <w:p>
-      <w:pPr>
-        <w:pStyle w:val="Normal"/>
-        <w:rPr>
-          <w:rFonts w:cs="" w:asciiTheme="minorHAnsi" w:cstheme="minorHAnsi" w:hAnsiTheme="minorHAnsi"/>
+          <w:rFonts w:ascii="Arial" w:hAnsi="Arial" w:cs="Arial" w:asciiTheme="minorHAnsi" w:cstheme="minorHAnsi" w:hAnsiTheme="minorHAnsi"/>
+          <w:sz w:val="20"/>
+          <w:szCs w:val="20"/>
+        </w:rPr>
+      </w:pPr>
+      <w:r>
+        <w:rPr>
+          <w:rFonts w:cs="Arial" w:cstheme="minorHAnsi" w:ascii="Arial" w:hAnsi="Arial"/>
+          <w:sz w:val="20"/>
+          <w:szCs w:val="20"/>
+        </w:rPr>
+      </w:r>
+    </w:p>
+    <w:p>
+      <w:pPr>
+        <w:pStyle w:val="Normal"/>
+        <w:rPr>
+          <w:rFonts w:ascii="Arial" w:hAnsi="Arial" w:cs="Arial" w:asciiTheme="minorHAnsi" w:cstheme="minorHAnsi" w:hAnsiTheme="minorHAnsi"/>
           <w:sz w:val="20"/>
           <w:szCs w:val="20"/>
         </w:rPr>
@@ -485,24 +485,24 @@
       <w:pPr>
         <w:pStyle w:val="Normal"/>
         <w:rPr>
-          <w:rFonts w:cs="" w:asciiTheme="minorHAnsi" w:cstheme="minorHAnsi" w:hAnsiTheme="minorHAnsi"/>
-          <w:sz w:val="20"/>
-          <w:szCs w:val="20"/>
-        </w:rPr>
-      </w:pPr>
-      <w:r>
-        <w:rPr>
-          <w:rFonts w:cs="" w:asciiTheme="minorHAnsi" w:cstheme="minorHAnsi" w:hAnsiTheme="minorHAnsi"/>
-          <w:sz w:val="20"/>
-          <w:szCs w:val="20"/>
-        </w:rPr>
-      </w:r>
-    </w:p>
-    <w:p>
-      <w:pPr>
-        <w:pStyle w:val="Normal"/>
-        <w:rPr>
-          <w:rFonts w:cs="" w:asciiTheme="minorHAnsi" w:cstheme="minorHAnsi" w:hAnsiTheme="minorHAnsi"/>
+          <w:rFonts w:ascii="Arial" w:hAnsi="Arial" w:cs="Arial" w:asciiTheme="minorHAnsi" w:cstheme="minorHAnsi" w:hAnsiTheme="minorHAnsi"/>
+          <w:sz w:val="20"/>
+          <w:szCs w:val="20"/>
+        </w:rPr>
+      </w:pPr>
+      <w:r>
+        <w:rPr>
+          <w:rFonts w:cs="Arial" w:cstheme="minorHAnsi" w:ascii="Arial" w:hAnsi="Arial"/>
+          <w:sz w:val="20"/>
+          <w:szCs w:val="20"/>
+        </w:rPr>
+      </w:r>
+    </w:p>
+    <w:p>
+      <w:pPr>
+        <w:pStyle w:val="Normal"/>
+        <w:rPr>
+          <w:rFonts w:ascii="Arial" w:hAnsi="Arial" w:cs="Arial" w:asciiTheme="minorHAnsi" w:cstheme="minorHAnsi" w:hAnsiTheme="minorHAnsi"/>
           <w:sz w:val="20"/>
           <w:szCs w:val="20"/>
         </w:rPr>
@@ -516,24 +516,24 @@
       <w:pPr>
         <w:pStyle w:val="Normal"/>
         <w:rPr>
-          <w:rFonts w:cs="" w:asciiTheme="minorHAnsi" w:cstheme="minorHAnsi" w:hAnsiTheme="minorHAnsi"/>
-          <w:sz w:val="20"/>
-          <w:szCs w:val="20"/>
-        </w:rPr>
-      </w:pPr>
-      <w:r>
-        <w:rPr>
-          <w:rFonts w:cs="" w:asciiTheme="minorHAnsi" w:cstheme="minorHAnsi" w:hAnsiTheme="minorHAnsi"/>
-          <w:sz w:val="20"/>
-          <w:szCs w:val="20"/>
-        </w:rPr>
-      </w:r>
-    </w:p>
-    <w:p>
-      <w:pPr>
-        <w:pStyle w:val="Normal"/>
-        <w:rPr>
-          <w:rFonts w:cs="" w:asciiTheme="minorHAnsi" w:cstheme="minorHAnsi" w:hAnsiTheme="minorHAnsi"/>
+          <w:rFonts w:ascii="Arial" w:hAnsi="Arial" w:cs="Arial" w:asciiTheme="minorHAnsi" w:cstheme="minorHAnsi" w:hAnsiTheme="minorHAnsi"/>
+          <w:sz w:val="20"/>
+          <w:szCs w:val="20"/>
+        </w:rPr>
+      </w:pPr>
+      <w:r>
+        <w:rPr>
+          <w:rFonts w:cs="Arial" w:cstheme="minorHAnsi" w:ascii="Arial" w:hAnsi="Arial"/>
+          <w:sz w:val="20"/>
+          <w:szCs w:val="20"/>
+        </w:rPr>
+      </w:r>
+    </w:p>
+    <w:p>
+      <w:pPr>
+        <w:pStyle w:val="Normal"/>
+        <w:rPr>
+          <w:rFonts w:ascii="Arial" w:hAnsi="Arial" w:cs="Arial" w:asciiTheme="minorHAnsi" w:cstheme="minorHAnsi" w:hAnsiTheme="minorHAnsi"/>
           <w:sz w:val="20"/>
           <w:szCs w:val="20"/>
         </w:rPr>
@@ -547,24 +547,24 @@
       <w:pPr>
         <w:pStyle w:val="Normal"/>
         <w:rPr>
-          <w:rFonts w:cs="" w:asciiTheme="minorHAnsi" w:cstheme="minorHAnsi" w:hAnsiTheme="minorHAnsi"/>
-          <w:sz w:val="20"/>
-          <w:szCs w:val="20"/>
-        </w:rPr>
-      </w:pPr>
-      <w:r>
-        <w:rPr>
-          <w:rFonts w:cs="" w:asciiTheme="minorHAnsi" w:cstheme="minorHAnsi" w:hAnsiTheme="minorHAnsi"/>
-          <w:sz w:val="20"/>
-          <w:szCs w:val="20"/>
-        </w:rPr>
-      </w:r>
-    </w:p>
-    <w:p>
-      <w:pPr>
-        <w:pStyle w:val="Normal"/>
-        <w:rPr>
-          <w:rFonts w:cs="" w:asciiTheme="minorHAnsi" w:cstheme="minorHAnsi" w:hAnsiTheme="minorHAnsi"/>
+          <w:rFonts w:ascii="Arial" w:hAnsi="Arial" w:cs="Arial" w:asciiTheme="minorHAnsi" w:cstheme="minorHAnsi" w:hAnsiTheme="minorHAnsi"/>
+          <w:sz w:val="20"/>
+          <w:szCs w:val="20"/>
+        </w:rPr>
+      </w:pPr>
+      <w:r>
+        <w:rPr>
+          <w:rFonts w:cs="Arial" w:cstheme="minorHAnsi" w:ascii="Arial" w:hAnsi="Arial"/>
+          <w:sz w:val="20"/>
+          <w:szCs w:val="20"/>
+        </w:rPr>
+      </w:r>
+    </w:p>
+    <w:p>
+      <w:pPr>
+        <w:pStyle w:val="Normal"/>
+        <w:rPr>
+          <w:rFonts w:ascii="Arial" w:hAnsi="Arial" w:cs="Arial" w:asciiTheme="minorHAnsi" w:cstheme="minorHAnsi" w:hAnsiTheme="minorHAnsi"/>
           <w:sz w:val="20"/>
           <w:szCs w:val="20"/>
         </w:rPr>
@@ -578,7 +578,7 @@
       <w:pPr>
         <w:pStyle w:val="Normal"/>
         <w:rPr>
-          <w:rFonts w:cs="" w:asciiTheme="minorHAnsi" w:cstheme="minorHAnsi" w:hAnsiTheme="minorHAnsi"/>
+          <w:rFonts w:ascii="Arial" w:hAnsi="Arial" w:cs="Arial" w:asciiTheme="minorHAnsi" w:cstheme="minorHAnsi" w:hAnsiTheme="minorHAnsi"/>
           <w:sz w:val="20"/>
           <w:szCs w:val="20"/>
         </w:rPr>
@@ -592,24 +592,24 @@
       <w:pPr>
         <w:pStyle w:val="Normal"/>
         <w:rPr>
-          <w:rFonts w:cs="" w:asciiTheme="minorHAnsi" w:cstheme="minorHAnsi" w:hAnsiTheme="minorHAnsi"/>
-          <w:sz w:val="20"/>
-          <w:szCs w:val="20"/>
-        </w:rPr>
-      </w:pPr>
-      <w:r>
-        <w:rPr>
-          <w:rFonts w:cs="" w:asciiTheme="minorHAnsi" w:cstheme="minorHAnsi" w:hAnsiTheme="minorHAnsi"/>
-          <w:sz w:val="20"/>
-          <w:szCs w:val="20"/>
-        </w:rPr>
-      </w:r>
-    </w:p>
-    <w:p>
-      <w:pPr>
-        <w:pStyle w:val="BodyText"/>
-        <w:rPr>
-          <w:rFonts w:cs="" w:asciiTheme="minorHAnsi" w:cstheme="minorHAnsi" w:hAnsiTheme="minorHAnsi"/>
+          <w:rFonts w:ascii="Arial" w:hAnsi="Arial" w:cs="Arial" w:asciiTheme="minorHAnsi" w:cstheme="minorHAnsi" w:hAnsiTheme="minorHAnsi"/>
+          <w:sz w:val="20"/>
+          <w:szCs w:val="20"/>
+        </w:rPr>
+      </w:pPr>
+      <w:r>
+        <w:rPr>
+          <w:rFonts w:cs="Arial" w:cstheme="minorHAnsi" w:ascii="Arial" w:hAnsi="Arial"/>
+          <w:sz w:val="20"/>
+          <w:szCs w:val="20"/>
+        </w:rPr>
+      </w:r>
+    </w:p>
+    <w:p>
+      <w:pPr>
+        <w:pStyle w:val="BodyText"/>
+        <w:rPr>
+          <w:rFonts w:ascii="Arial" w:hAnsi="Arial" w:cs="Arial" w:asciiTheme="minorHAnsi" w:cstheme="minorHAnsi" w:hAnsiTheme="minorHAnsi"/>
           <w:sz w:val="20"/>
           <w:szCs w:val="20"/>
         </w:rPr>
@@ -623,7 +623,7 @@
       <w:pPr>
         <w:pStyle w:val="BodyText"/>
         <w:rPr>
-          <w:rFonts w:cs="" w:asciiTheme="minorHAnsi" w:cstheme="minorHAnsi" w:hAnsiTheme="minorHAnsi"/>
+          <w:rFonts w:ascii="Arial" w:hAnsi="Arial" w:cs="Arial" w:asciiTheme="minorHAnsi" w:cstheme="minorHAnsi" w:hAnsiTheme="minorHAnsi"/>
           <w:sz w:val="20"/>
           <w:szCs w:val="20"/>
         </w:rPr>
@@ -637,7 +637,7 @@
       <w:pPr>
         <w:pStyle w:val="BodyText"/>
         <w:rPr>
-          <w:rFonts w:cs="" w:asciiTheme="minorHAnsi" w:cstheme="minorHAnsi" w:hAnsiTheme="minorHAnsi"/>
+          <w:rFonts w:ascii="Arial" w:hAnsi="Arial" w:cs="Arial" w:asciiTheme="minorHAnsi" w:cstheme="minorHAnsi" w:hAnsiTheme="minorHAnsi"/>
           <w:sz w:val="20"/>
           <w:szCs w:val="20"/>
         </w:rPr>
@@ -651,7 +651,7 @@
       <w:pPr>
         <w:pStyle w:val="BodyText"/>
         <w:rPr>
-          <w:rFonts w:cs="" w:asciiTheme="minorHAnsi" w:cstheme="minorHAnsi" w:hAnsiTheme="minorHAnsi"/>
+          <w:rFonts w:ascii="Arial" w:hAnsi="Arial" w:cs="Arial" w:asciiTheme="minorHAnsi" w:cstheme="minorHAnsi" w:hAnsiTheme="minorHAnsi"/>
           <w:sz w:val="20"/>
           <w:szCs w:val="20"/>
         </w:rPr>
@@ -665,7 +665,7 @@
       <w:pPr>
         <w:pStyle w:val="BodyText"/>
         <w:rPr>
-          <w:rFonts w:cs="" w:asciiTheme="minorHAnsi" w:cstheme="minorHAnsi" w:hAnsiTheme="minorHAnsi"/>
+          <w:rFonts w:ascii="Arial" w:hAnsi="Arial" w:cs="Arial" w:asciiTheme="minorHAnsi" w:cstheme="minorHAnsi" w:hAnsiTheme="minorHAnsi"/>
           <w:sz w:val="20"/>
           <w:szCs w:val="20"/>
         </w:rPr>
@@ -679,7 +679,7 @@
       <w:pPr>
         <w:pStyle w:val="BodyText"/>
         <w:rPr>
-          <w:rFonts w:cs="" w:asciiTheme="minorHAnsi" w:cstheme="minorHAnsi" w:hAnsiTheme="minorHAnsi"/>
+          <w:rFonts w:ascii="Arial" w:hAnsi="Arial" w:cs="Arial" w:asciiTheme="minorHAnsi" w:cstheme="minorHAnsi" w:hAnsiTheme="minorHAnsi"/>
           <w:sz w:val="20"/>
           <w:szCs w:val="20"/>
         </w:rPr>
@@ -693,7 +693,7 @@
       <w:pPr>
         <w:pStyle w:val="BodyText"/>
         <w:rPr>
-          <w:rFonts w:cs="" w:asciiTheme="minorHAnsi" w:cstheme="minorHAnsi" w:hAnsiTheme="minorHAnsi"/>
+          <w:rFonts w:ascii="Arial" w:hAnsi="Arial" w:cs="Arial" w:asciiTheme="minorHAnsi" w:cstheme="minorHAnsi" w:hAnsiTheme="minorHAnsi"/>
           <w:sz w:val="20"/>
           <w:szCs w:val="20"/>
         </w:rPr>
@@ -707,24 +707,24 @@
       <w:pPr>
         <w:pStyle w:val="Normal"/>
         <w:rPr>
-          <w:rFonts w:cs="" w:asciiTheme="minorHAnsi" w:cstheme="minorHAnsi" w:hAnsiTheme="minorHAnsi"/>
-          <w:sz w:val="20"/>
-          <w:szCs w:val="20"/>
-        </w:rPr>
-      </w:pPr>
-      <w:r>
-        <w:rPr>
-          <w:rFonts w:cs="" w:asciiTheme="minorHAnsi" w:cstheme="minorHAnsi" w:hAnsiTheme="minorHAnsi"/>
-          <w:sz w:val="20"/>
-          <w:szCs w:val="20"/>
-        </w:rPr>
-      </w:r>
-    </w:p>
-    <w:p>
-      <w:pPr>
-        <w:pStyle w:val="Normal"/>
-        <w:rPr>
-          <w:rFonts w:cs="" w:asciiTheme="minorHAnsi" w:cstheme="minorHAnsi" w:hAnsiTheme="minorHAnsi"/>
+          <w:rFonts w:ascii="Arial" w:hAnsi="Arial" w:cs="Arial" w:asciiTheme="minorHAnsi" w:cstheme="minorHAnsi" w:hAnsiTheme="minorHAnsi"/>
+          <w:sz w:val="20"/>
+          <w:szCs w:val="20"/>
+        </w:rPr>
+      </w:pPr>
+      <w:r>
+        <w:rPr>
+          <w:rFonts w:cs="Arial" w:cstheme="minorHAnsi" w:ascii="Arial" w:hAnsi="Arial"/>
+          <w:sz w:val="20"/>
+          <w:szCs w:val="20"/>
+        </w:rPr>
+      </w:r>
+    </w:p>
+    <w:p>
+      <w:pPr>
+        <w:pStyle w:val="Normal"/>
+        <w:rPr>
+          <w:rFonts w:ascii="Arial" w:hAnsi="Arial" w:cs="Arial" w:asciiTheme="minorHAnsi" w:cstheme="minorHAnsi" w:hAnsiTheme="minorHAnsi"/>
           <w:sz w:val="20"/>
           <w:szCs w:val="20"/>
         </w:rPr>
@@ -738,14 +738,14 @@
       <w:pPr>
         <w:pStyle w:val="Normal"/>
         <w:rPr>
-          <w:rFonts w:cs="" w:asciiTheme="minorHAnsi" w:cstheme="minorHAnsi" w:hAnsiTheme="minorHAnsi"/>
-          <w:sz w:val="20"/>
-          <w:szCs w:val="20"/>
-        </w:rPr>
-      </w:pPr>
-      <w:r>
-        <w:rPr>
-          <w:rFonts w:cs="" w:asciiTheme="minorHAnsi" w:cstheme="minorHAnsi" w:hAnsiTheme="minorHAnsi"/>
+          <w:rFonts w:ascii="Arial" w:hAnsi="Arial" w:cs="Arial" w:asciiTheme="minorHAnsi" w:cstheme="minorHAnsi" w:hAnsiTheme="minorHAnsi"/>
+          <w:sz w:val="20"/>
+          <w:szCs w:val="20"/>
+        </w:rPr>
+      </w:pPr>
+      <w:r>
+        <w:rPr>
+          <w:rFonts w:cs="Arial" w:ascii="Arial" w:hAnsi="Arial" w:asciiTheme="minorHAnsi" w:cstheme="minorHAnsi" w:hAnsiTheme="minorHAnsi"/>
           <w:sz w:val="20"/>
           <w:szCs w:val="20"/>
         </w:rPr>
@@ -756,31 +756,31 @@
       <w:pPr>
         <w:pStyle w:val="LigneH2"/>
         <w:rPr>
-          <w:rFonts w:cs="" w:asciiTheme="minorHAnsi" w:cstheme="minorHAnsi" w:hAnsiTheme="minorHAnsi"/>
-          <w:sz w:val="20"/>
-          <w:szCs w:val="20"/>
-        </w:rPr>
-      </w:pPr>
-      <w:r>
-        <w:rPr>
-          <w:rFonts w:cs="" w:asciiTheme="minorHAnsi" w:cstheme="minorHAnsi" w:hAnsiTheme="minorHAnsi"/>
-          <w:sz w:val="20"/>
-          <w:szCs w:val="20"/>
-        </w:rPr>
-      </w:r>
-    </w:p>
-    <w:p>
-      <w:pPr>
-        <w:pStyle w:val="BodyText"/>
-        <w:rPr>
-          <w:rFonts w:cs="" w:asciiTheme="minorHAnsi" w:cstheme="minorHAnsi" w:hAnsiTheme="minorHAnsi"/>
-          <w:sz w:val="20"/>
-          <w:szCs w:val="20"/>
-        </w:rPr>
-      </w:pPr>
-      <w:r>
-        <w:rPr>
-          <w:rFonts w:cs="" w:asciiTheme="minorHAnsi" w:cstheme="minorHAnsi" w:hAnsiTheme="minorHAnsi"/>
+          <w:rFonts w:ascii="Arial" w:hAnsi="Arial" w:cs="Arial" w:asciiTheme="minorHAnsi" w:cstheme="minorHAnsi" w:hAnsiTheme="minorHAnsi"/>
+          <w:sz w:val="20"/>
+          <w:szCs w:val="20"/>
+        </w:rPr>
+      </w:pPr>
+      <w:r>
+        <w:rPr>
+          <w:rFonts w:cs="Arial" w:cstheme="minorHAnsi" w:ascii="Arial" w:hAnsi="Arial"/>
+          <w:sz w:val="20"/>
+          <w:szCs w:val="20"/>
+        </w:rPr>
+      </w:r>
+    </w:p>
+    <w:p>
+      <w:pPr>
+        <w:pStyle w:val="BodyText"/>
+        <w:rPr>
+          <w:rFonts w:ascii="Arial" w:hAnsi="Arial" w:cs="Arial" w:asciiTheme="minorHAnsi" w:cstheme="minorHAnsi" w:hAnsiTheme="minorHAnsi"/>
+          <w:sz w:val="20"/>
+          <w:szCs w:val="20"/>
+        </w:rPr>
+      </w:pPr>
+      <w:r>
+        <w:rPr>
+          <w:rFonts w:cs="Arial" w:ascii="Arial" w:hAnsi="Arial" w:asciiTheme="minorHAnsi" w:cstheme="minorHAnsi" w:hAnsiTheme="minorHAnsi"/>
           <w:sz w:val="20"/>
           <w:szCs w:val="20"/>
         </w:rPr>
@@ -803,7 +803,7 @@
       </w:pPr>
       <w:r>
         <w:rPr>
-          <w:rFonts w:cs="" w:asciiTheme="minorHAnsi" w:cstheme="minorHAnsi" w:hAnsiTheme="minorHAnsi"/>
+          <w:rFonts w:cs="Arial" w:ascii="Arial" w:hAnsi="Arial" w:asciiTheme="minorHAnsi" w:cstheme="minorHAnsi" w:hAnsiTheme="minorHAnsi"/>
           <w:sz w:val="20"/>
           <w:szCs w:val="20"/>
         </w:rPr>
@@ -812,26 +812,26 @@
     </w:p>
     <w:p>
       <w:pPr>
-        <w:pStyle w:val="Lignehorizontaleuser"/>
-        <w:rPr>
-          <w:rFonts w:cs="" w:asciiTheme="minorHAnsi" w:cstheme="minorHAnsi" w:hAnsiTheme="minorHAnsi"/>
-          <w:sz w:val="20"/>
-          <w:szCs w:val="20"/>
-        </w:rPr>
-      </w:pPr>
-      <w:r>
-        <w:rPr>
-          <w:rFonts w:cs="" w:asciiTheme="minorHAnsi" w:cstheme="minorHAnsi" w:hAnsiTheme="minorHAnsi"/>
-          <w:sz w:val="20"/>
-          <w:szCs w:val="20"/>
-        </w:rPr>
-      </w:r>
-    </w:p>
-    <w:p>
-      <w:pPr>
-        <w:pStyle w:val="BodyText"/>
-        <w:rPr>
-          <w:rFonts w:cs="" w:asciiTheme="minorHAnsi" w:cstheme="minorHAnsi" w:hAnsiTheme="minorHAnsi"/>
+        <w:pStyle w:val="Lignehorizontale"/>
+        <w:rPr>
+          <w:rFonts w:ascii="Arial" w:hAnsi="Arial" w:cs="Arial" w:asciiTheme="minorHAnsi" w:cstheme="minorHAnsi" w:hAnsiTheme="minorHAnsi"/>
+          <w:sz w:val="20"/>
+          <w:szCs w:val="20"/>
+        </w:rPr>
+      </w:pPr>
+      <w:r>
+        <w:rPr>
+          <w:rFonts w:cs="Arial" w:cstheme="minorHAnsi" w:ascii="Arial" w:hAnsi="Arial"/>
+          <w:sz w:val="20"/>
+          <w:szCs w:val="20"/>
+        </w:rPr>
+      </w:r>
+    </w:p>
+    <w:p>
+      <w:pPr>
+        <w:pStyle w:val="BodyText"/>
+        <w:rPr>
+          <w:rFonts w:ascii="Arial" w:hAnsi="Arial" w:cs="Arial" w:asciiTheme="minorHAnsi" w:cstheme="minorHAnsi" w:hAnsiTheme="minorHAnsi"/>
           <w:sz w:val="20"/>
           <w:szCs w:val="20"/>
         </w:rPr>
@@ -855,7 +855,7 @@
       <w:pPr>
         <w:pStyle w:val="BodyText"/>
         <w:rPr>
-          <w:rFonts w:cs="" w:asciiTheme="minorHAnsi" w:cstheme="minorHAnsi" w:hAnsiTheme="minorHAnsi"/>
+          <w:rFonts w:ascii="Arial" w:hAnsi="Arial" w:cs="Arial" w:asciiTheme="minorHAnsi" w:cstheme="minorHAnsi" w:hAnsiTheme="minorHAnsi"/>
           <w:sz w:val="20"/>
           <w:szCs w:val="20"/>
         </w:rPr>
@@ -869,7 +869,7 @@
       <w:pPr>
         <w:pStyle w:val="BodyText"/>
         <w:rPr>
-          <w:rFonts w:cs="" w:asciiTheme="minorHAnsi" w:cstheme="minorHAnsi" w:hAnsiTheme="minorHAnsi"/>
+          <w:rFonts w:ascii="Arial" w:hAnsi="Arial" w:cs="Arial" w:asciiTheme="minorHAnsi" w:cstheme="minorHAnsi" w:hAnsiTheme="minorHAnsi"/>
           <w:sz w:val="20"/>
           <w:szCs w:val="20"/>
         </w:rPr>
@@ -883,7 +883,7 @@
       <w:pPr>
         <w:pStyle w:val="BodyText"/>
         <w:rPr>
-          <w:rFonts w:cs="" w:asciiTheme="minorHAnsi" w:cstheme="minorHAnsi" w:hAnsiTheme="minorHAnsi"/>
+          <w:rFonts w:ascii="Arial" w:hAnsi="Arial" w:cs="Arial" w:asciiTheme="minorHAnsi" w:cstheme="minorHAnsi" w:hAnsiTheme="minorHAnsi"/>
           <w:sz w:val="20"/>
           <w:szCs w:val="20"/>
         </w:rPr>
@@ -897,7 +897,7 @@
       <w:pPr>
         <w:pStyle w:val="BodyText"/>
         <w:rPr>
-          <w:rFonts w:cs="" w:asciiTheme="minorHAnsi" w:cstheme="minorHAnsi" w:hAnsiTheme="minorHAnsi"/>
+          <w:rFonts w:ascii="Arial" w:hAnsi="Arial" w:cs="Arial" w:asciiTheme="minorHAnsi" w:cstheme="minorHAnsi" w:hAnsiTheme="minorHAnsi"/>
           <w:sz w:val="20"/>
           <w:szCs w:val="20"/>
         </w:rPr>
@@ -911,7 +911,7 @@
       <w:pPr>
         <w:pStyle w:val="BodyText"/>
         <w:rPr>
-          <w:rFonts w:cs="" w:asciiTheme="minorHAnsi" w:cstheme="minorHAnsi" w:hAnsiTheme="minorHAnsi"/>
+          <w:rFonts w:ascii="Arial" w:hAnsi="Arial" w:cs="Arial" w:asciiTheme="minorHAnsi" w:cstheme="minorHAnsi" w:hAnsiTheme="minorHAnsi"/>
           <w:sz w:val="20"/>
           <w:szCs w:val="20"/>
         </w:rPr>
@@ -925,7 +925,7 @@
       <w:pPr>
         <w:pStyle w:val="BodyText"/>
         <w:rPr>
-          <w:rFonts w:cs="" w:asciiTheme="minorHAnsi" w:cstheme="minorHAnsi" w:hAnsiTheme="minorHAnsi"/>
+          <w:rFonts w:ascii="Arial" w:hAnsi="Arial" w:cs="Arial" w:asciiTheme="minorHAnsi" w:cstheme="minorHAnsi" w:hAnsiTheme="minorHAnsi"/>
           <w:sz w:val="20"/>
           <w:szCs w:val="20"/>
         </w:rPr>
@@ -939,7 +939,7 @@
       <w:pPr>
         <w:pStyle w:val="BodyText"/>
         <w:rPr>
-          <w:rFonts w:cs="" w:asciiTheme="minorHAnsi" w:cstheme="minorHAnsi" w:hAnsiTheme="minorHAnsi"/>
+          <w:rFonts w:ascii="Arial" w:hAnsi="Arial" w:cs="Arial" w:asciiTheme="minorHAnsi" w:cstheme="minorHAnsi" w:hAnsiTheme="minorHAnsi"/>
           <w:sz w:val="20"/>
           <w:szCs w:val="20"/>
         </w:rPr>
@@ -953,7 +953,7 @@
       <w:pPr>
         <w:pStyle w:val="BodyText"/>
         <w:rPr>
-          <w:rFonts w:cs="" w:asciiTheme="minorHAnsi" w:cstheme="minorHAnsi" w:hAnsiTheme="minorHAnsi"/>
+          <w:rFonts w:ascii="Arial" w:hAnsi="Arial" w:cs="Arial" w:asciiTheme="minorHAnsi" w:cstheme="minorHAnsi" w:hAnsiTheme="minorHAnsi"/>
           <w:sz w:val="20"/>
           <w:szCs w:val="20"/>
         </w:rPr>
@@ -967,7 +967,7 @@
       <w:pPr>
         <w:pStyle w:val="BodyText"/>
         <w:rPr>
-          <w:rFonts w:cs="" w:asciiTheme="minorHAnsi" w:cstheme="minorHAnsi" w:hAnsiTheme="minorHAnsi"/>
+          <w:rFonts w:ascii="Arial" w:hAnsi="Arial" w:cs="Arial" w:asciiTheme="minorHAnsi" w:cstheme="minorHAnsi" w:hAnsiTheme="minorHAnsi"/>
           <w:sz w:val="20"/>
           <w:szCs w:val="20"/>
         </w:rPr>
@@ -981,7 +981,7 @@
       <w:pPr>
         <w:pStyle w:val="BodyText"/>
         <w:rPr>
-          <w:rFonts w:cs="" w:asciiTheme="minorHAnsi" w:cstheme="minorHAnsi" w:hAnsiTheme="minorHAnsi"/>
+          <w:rFonts w:ascii="Arial" w:hAnsi="Arial" w:cs="Arial" w:asciiTheme="minorHAnsi" w:cstheme="minorHAnsi" w:hAnsiTheme="minorHAnsi"/>
           <w:sz w:val="20"/>
           <w:szCs w:val="20"/>
         </w:rPr>
@@ -995,7 +995,7 @@
       <w:pPr>
         <w:pStyle w:val="BodyText"/>
         <w:rPr>
-          <w:rFonts w:cs="" w:asciiTheme="minorHAnsi" w:cstheme="minorHAnsi" w:hAnsiTheme="minorHAnsi"/>
+          <w:rFonts w:ascii="Arial" w:hAnsi="Arial" w:cs="Arial" w:asciiTheme="minorHAnsi" w:cstheme="minorHAnsi" w:hAnsiTheme="minorHAnsi"/>
           <w:sz w:val="20"/>
           <w:szCs w:val="20"/>
         </w:rPr>
@@ -1009,7 +1009,7 @@
       <w:pPr>
         <w:pStyle w:val="BodyText"/>
         <w:rPr>
-          <w:rFonts w:cs="" w:asciiTheme="minorHAnsi" w:cstheme="minorHAnsi" w:hAnsiTheme="minorHAnsi"/>
+          <w:rFonts w:ascii="Arial" w:hAnsi="Arial" w:cs="Arial" w:asciiTheme="minorHAnsi" w:cstheme="minorHAnsi" w:hAnsiTheme="minorHAnsi"/>
           <w:sz w:val="20"/>
           <w:szCs w:val="20"/>
         </w:rPr>
@@ -1023,7 +1023,7 @@
       <w:pPr>
         <w:pStyle w:val="BodyText"/>
         <w:rPr>
-          <w:rFonts w:cs="" w:asciiTheme="minorHAnsi" w:cstheme="minorHAnsi" w:hAnsiTheme="minorHAnsi"/>
+          <w:rFonts w:ascii="Arial" w:hAnsi="Arial" w:cs="Arial" w:asciiTheme="minorHAnsi" w:cstheme="minorHAnsi" w:hAnsiTheme="minorHAnsi"/>
           <w:sz w:val="20"/>
           <w:szCs w:val="20"/>
         </w:rPr>
@@ -1037,7 +1037,7 @@
       <w:pPr>
         <w:pStyle w:val="BodyText"/>
         <w:rPr>
-          <w:rFonts w:cs="" w:asciiTheme="minorHAnsi" w:cstheme="minorHAnsi" w:hAnsiTheme="minorHAnsi"/>
+          <w:rFonts w:ascii="Arial" w:hAnsi="Arial" w:cs="Arial" w:asciiTheme="minorHAnsi" w:cstheme="minorHAnsi" w:hAnsiTheme="minorHAnsi"/>
           <w:sz w:val="20"/>
           <w:szCs w:val="20"/>
         </w:rPr>
@@ -1051,14 +1051,14 @@
       <w:pPr>
         <w:pStyle w:val="Normal"/>
         <w:rPr>
-          <w:rFonts w:cs="" w:asciiTheme="minorHAnsi" w:cstheme="minorHAnsi" w:hAnsiTheme="minorHAnsi"/>
-          <w:sz w:val="20"/>
-          <w:szCs w:val="20"/>
-        </w:rPr>
-      </w:pPr>
-      <w:r>
-        <w:rPr>
-          <w:rFonts w:cs="" w:asciiTheme="minorHAnsi" w:cstheme="minorHAnsi" w:hAnsiTheme="minorHAnsi"/>
+          <w:rFonts w:ascii="Arial" w:hAnsi="Arial" w:cs="Arial" w:asciiTheme="minorHAnsi" w:cstheme="minorHAnsi" w:hAnsiTheme="minorHAnsi"/>
+          <w:sz w:val="20"/>
+          <w:szCs w:val="20"/>
+        </w:rPr>
+      </w:pPr>
+      <w:r>
+        <w:rPr>
+          <w:rFonts w:cs="Arial" w:ascii="Arial" w:hAnsi="Arial" w:asciiTheme="minorHAnsi" w:cstheme="minorHAnsi" w:hAnsiTheme="minorHAnsi"/>
           <w:sz w:val="20"/>
           <w:szCs w:val="20"/>
         </w:rPr>
@@ -1069,24 +1069,24 @@
       <w:pPr>
         <w:pStyle w:val="LigneH2"/>
         <w:rPr>
-          <w:rFonts w:cs="" w:asciiTheme="minorHAnsi" w:cstheme="minorHAnsi" w:hAnsiTheme="minorHAnsi"/>
-          <w:sz w:val="20"/>
-          <w:szCs w:val="20"/>
-        </w:rPr>
-      </w:pPr>
-      <w:r>
-        <w:rPr>
-          <w:rFonts w:cs="" w:asciiTheme="minorHAnsi" w:cstheme="minorHAnsi" w:hAnsiTheme="minorHAnsi"/>
-          <w:sz w:val="20"/>
-          <w:szCs w:val="20"/>
-        </w:rPr>
-      </w:r>
-    </w:p>
-    <w:p>
-      <w:pPr>
-        <w:pStyle w:val="BodyText"/>
-        <w:rPr>
-          <w:rFonts w:cs="" w:asciiTheme="minorHAnsi" w:cstheme="minorHAnsi" w:hAnsiTheme="minorHAnsi"/>
+          <w:rFonts w:ascii="Arial" w:hAnsi="Arial" w:cs="Arial" w:asciiTheme="minorHAnsi" w:cstheme="minorHAnsi" w:hAnsiTheme="minorHAnsi"/>
+          <w:sz w:val="20"/>
+          <w:szCs w:val="20"/>
+        </w:rPr>
+      </w:pPr>
+      <w:r>
+        <w:rPr>
+          <w:rFonts w:cs="Arial" w:cstheme="minorHAnsi" w:ascii="Arial" w:hAnsi="Arial"/>
+          <w:sz w:val="20"/>
+          <w:szCs w:val="20"/>
+        </w:rPr>
+      </w:r>
+    </w:p>
+    <w:p>
+      <w:pPr>
+        <w:pStyle w:val="BodyText"/>
+        <w:rPr>
+          <w:rFonts w:ascii="Arial" w:hAnsi="Arial" w:cs="Arial" w:asciiTheme="minorHAnsi" w:cstheme="minorHAnsi" w:hAnsiTheme="minorHAnsi"/>
           <w:sz w:val="20"/>
           <w:szCs w:val="20"/>
         </w:rPr>
@@ -1094,7 +1094,7 @@
       <w:r>
         <w:rPr>
           <w:rStyle w:val="Citation"/>
-          <w:rFonts w:eastAsia="Noto Serif CJK SC" w:cs="" w:asciiTheme="minorHAnsi" w:cstheme="minorHAnsi" w:hAnsiTheme="minorHAnsi"/>
+          <w:rFonts w:eastAsia="Noto Serif CJK SC" w:cs="Arial" w:ascii="Arial" w:hAnsi="Arial" w:asciiTheme="minorHAnsi" w:cstheme="minorHAnsi" w:hAnsiTheme="minorHAnsi"/>
           <w:color w:val="auto"/>
           <w:kern w:val="2"/>
           <w:sz w:val="20"/>
@@ -1108,7 +1108,7 @@
       <w:pPr>
         <w:pStyle w:val="BodyText"/>
         <w:rPr>
-          <w:rFonts w:cs="" w:asciiTheme="minorHAnsi" w:cstheme="minorHAnsi" w:hAnsiTheme="minorHAnsi"/>
+          <w:rFonts w:ascii="Arial" w:hAnsi="Arial" w:cs="Arial" w:asciiTheme="minorHAnsi" w:cstheme="minorHAnsi" w:hAnsiTheme="minorHAnsi"/>
           <w:sz w:val="20"/>
           <w:szCs w:val="20"/>
         </w:rPr>
@@ -1116,7 +1116,7 @@
       <w:r>
         <w:rPr>
           <w:rStyle w:val="Citation"/>
-          <w:rFonts w:eastAsia="Noto Serif CJK SC" w:cs="" w:asciiTheme="minorHAnsi" w:cstheme="minorHAnsi" w:hAnsiTheme="minorHAnsi"/>
+          <w:rFonts w:eastAsia="Noto Serif CJK SC" w:cs="Arial" w:ascii="Arial" w:hAnsi="Arial" w:asciiTheme="minorHAnsi" w:cstheme="minorHAnsi" w:hAnsiTheme="minorHAnsi"/>
           <w:color w:val="auto"/>
           <w:kern w:val="2"/>
           <w:sz w:val="20"/>
@@ -1130,7 +1130,7 @@
       <w:pPr>
         <w:pStyle w:val="BodyText"/>
         <w:rPr>
-          <w:rFonts w:cs="" w:asciiTheme="minorHAnsi" w:cstheme="minorHAnsi" w:hAnsiTheme="minorHAnsi"/>
+          <w:rFonts w:ascii="Arial" w:hAnsi="Arial" w:cs="Arial" w:asciiTheme="minorHAnsi" w:cstheme="minorHAnsi" w:hAnsiTheme="minorHAnsi"/>
           <w:sz w:val="20"/>
           <w:szCs w:val="20"/>
         </w:rPr>
@@ -1138,7 +1138,7 @@
       <w:r>
         <w:rPr>
           <w:rStyle w:val="Citation"/>
-          <w:rFonts w:eastAsia="Noto Serif CJK SC" w:cs="" w:asciiTheme="minorHAnsi" w:cstheme="minorHAnsi" w:hAnsiTheme="minorHAnsi"/>
+          <w:rFonts w:eastAsia="Noto Serif CJK SC" w:cs="Arial" w:ascii="Arial" w:hAnsi="Arial" w:asciiTheme="minorHAnsi" w:cstheme="minorHAnsi" w:hAnsiTheme="minorHAnsi"/>
           <w:color w:val="auto"/>
           <w:kern w:val="2"/>
           <w:sz w:val="20"/>
@@ -1152,31 +1152,31 @@
       <w:pPr>
         <w:pStyle w:val="BodyText"/>
         <w:rPr>
-          <w:rFonts w:cs="" w:asciiTheme="minorHAnsi" w:cstheme="minorHAnsi" w:hAnsiTheme="minorHAnsi"/>
-          <w:sz w:val="20"/>
-          <w:szCs w:val="20"/>
-        </w:rPr>
-      </w:pPr>
-      <w:r>
-        <w:rPr>
-          <w:rFonts w:cs="" w:asciiTheme="minorHAnsi" w:cstheme="minorHAnsi" w:hAnsiTheme="minorHAnsi"/>
-          <w:sz w:val="20"/>
-          <w:szCs w:val="20"/>
-        </w:rPr>
-      </w:r>
-    </w:p>
-    <w:p>
-      <w:pPr>
-        <w:pStyle w:val="BodyText"/>
-        <w:rPr>
-          <w:rFonts w:cs="" w:asciiTheme="minorHAnsi" w:cstheme="minorHAnsi" w:hAnsiTheme="minorHAnsi"/>
-          <w:sz w:val="20"/>
-          <w:szCs w:val="20"/>
-        </w:rPr>
-      </w:pPr>
-      <w:r>
-        <w:rPr>
-          <w:rFonts w:cs="" w:asciiTheme="minorHAnsi" w:cstheme="minorHAnsi" w:hAnsiTheme="minorHAnsi"/>
+          <w:rFonts w:ascii="Arial" w:hAnsi="Arial" w:cs="Arial" w:asciiTheme="minorHAnsi" w:cstheme="minorHAnsi" w:hAnsiTheme="minorHAnsi"/>
+          <w:sz w:val="20"/>
+          <w:szCs w:val="20"/>
+        </w:rPr>
+      </w:pPr>
+      <w:r>
+        <w:rPr>
+          <w:rFonts w:cs="Arial" w:cstheme="minorHAnsi" w:ascii="Arial" w:hAnsi="Arial"/>
+          <w:sz w:val="20"/>
+          <w:szCs w:val="20"/>
+        </w:rPr>
+      </w:r>
+    </w:p>
+    <w:p>
+      <w:pPr>
+        <w:pStyle w:val="BodyText"/>
+        <w:rPr>
+          <w:rFonts w:ascii="Arial" w:hAnsi="Arial" w:cs="Arial" w:asciiTheme="minorHAnsi" w:cstheme="minorHAnsi" w:hAnsiTheme="minorHAnsi"/>
+          <w:sz w:val="20"/>
+          <w:szCs w:val="20"/>
+        </w:rPr>
+      </w:pPr>
+      <w:r>
+        <w:rPr>
+          <w:rFonts w:cs="Arial" w:cstheme="minorHAnsi" w:ascii="Arial" w:hAnsi="Arial"/>
           <w:sz w:val="20"/>
           <w:szCs w:val="20"/>
         </w:rPr>
@@ -1207,7 +1207,7 @@
     </w:p>
     <w:p>
       <w:pPr>
-        <w:pStyle w:val="Lignehorizontaleuser"/>
+        <w:pStyle w:val="Lignehorizontale"/>
         <w:suppressLineNumbers/>
         <w:pBdr>
           <w:bottom w:val="double" w:sz="2" w:space="0" w:color="808080"/>
@@ -1313,7 +1313,7 @@
       <w:r>
         <w:rPr>
           <w:rStyle w:val="Citation"/>
-          <w:rFonts w:eastAsia="Noto Serif CJK SC" w:cs="" w:asciiTheme="minorHAnsi" w:cstheme="minorHAnsi" w:hAnsiTheme="minorHAnsi"/>
+          <w:rFonts w:eastAsia="Noto Serif CJK SC" w:cs="Arial" w:ascii="Arial" w:hAnsi="Arial" w:asciiTheme="minorHAnsi" w:cstheme="minorHAnsi" w:hAnsiTheme="minorHAnsi"/>
           <w:i w:val="false"/>
           <w:iCs w:val="false"/>
           <w:color w:val="auto"/>
@@ -1635,7 +1635,7 @@
   </w:style>
   <w:style w:type="paragraph" w:styleId="Heading1">
     <w:name w:val="heading 1"/>
-    <w:basedOn w:val="Titreuser"/>
+    <w:basedOn w:val="Titre"/>
     <w:next w:val="BodyText"/>
     <w:qFormat/>
     <w:pPr>
@@ -1655,7 +1655,7 @@
   </w:style>
   <w:style w:type="paragraph" w:styleId="Heading2">
     <w:name w:val="heading 2"/>
-    <w:basedOn w:val="Titreuser"/>
+    <w:basedOn w:val="Titre"/>
     <w:next w:val="BodyText"/>
     <w:qFormat/>
     <w:pPr>
@@ -1672,7 +1672,7 @@
   </w:style>
   <w:style w:type="paragraph" w:styleId="Heading4">
     <w:name w:val="heading 4"/>
-    <w:basedOn w:val="Titreuser"/>
+    <w:basedOn w:val="Titre"/>
     <w:next w:val="BodyText"/>
     <w:qFormat/>
     <w:pPr>
@@ -1710,7 +1710,7 @@
       <w:spacing w:before="240" w:after="120"/>
     </w:pPr>
     <w:rPr>
-      <w:rFonts w:ascii="Liberation Sans" w:hAnsi="Liberation Sans" w:eastAsia="Noto Sans CJK SC" w:cs="Noto Sans Devanagari"/>
+      <w:rFonts w:ascii="Liberation Sans" w:hAnsi="Liberation Sans" w:eastAsia="Noto Sans CJK SC" w:cs="Lohit Devanagari"/>
       <w:sz w:val="28"/>
       <w:szCs w:val="28"/>
     </w:rPr>
@@ -1768,14 +1768,14 @@
       <w:spacing w:before="240" w:after="120"/>
     </w:pPr>
     <w:rPr>
-      <w:rFonts w:ascii="Liberation Sans" w:hAnsi="Liberation Sans" w:eastAsia="Noto Sans CJK SC" w:cs="Lohit Devanagari"/>
+      <w:rFonts w:ascii="Liberation Sans" w:hAnsi="Liberation Sans" w:eastAsia="Noto Sans CJK SC" w:cs="Noto Sans Devanagari"/>
       <w:sz w:val="28"/>
       <w:szCs w:val="28"/>
     </w:rPr>
   </w:style>
   <w:style w:type="paragraph" w:styleId="Title">
     <w:name w:val="Title"/>
-    <w:basedOn w:val="Titreuser"/>
+    <w:basedOn w:val="Titre"/>
     <w:next w:val="BodyText"/>
     <w:qFormat/>
     <w:pPr>
@@ -1788,8 +1788,8 @@
       <w:szCs w:val="56"/>
     </w:rPr>
   </w:style>
-  <w:style w:type="paragraph" w:styleId="Lignehorizontaleuser">
-    <w:name w:val="Ligne horizontale (user)"/>
+  <w:style w:type="paragraph" w:styleId="Lignehorizontale">
+    <w:name w:val="Ligne horizontale"/>
     <w:basedOn w:val="Normal"/>
     <w:next w:val="BodyText"/>
     <w:qFormat/>
@@ -1805,8 +1805,8 @@
       <w:szCs w:val="12"/>
     </w:rPr>
   </w:style>
-  <w:style w:type="paragraph" w:styleId="Texteprformatuser">
-    <w:name w:val="Texte préformaté (user)"/>
+  <w:style w:type="paragraph" w:styleId="Texteprformat">
+    <w:name w:val="Texte préformaté"/>
     <w:basedOn w:val="Normal"/>
     <w:qFormat/>
     <w:pPr>
@@ -1820,7 +1820,7 @@
   </w:style>
   <w:style w:type="paragraph" w:styleId="LigneH2">
     <w:name w:val="Ligne H 2"/>
-    <w:basedOn w:val="Lignehorizontaleuser"/>
+    <w:basedOn w:val="Lignehorizontale"/>
     <w:qFormat/>
     <w:pPr>
       <w:pBdr>
@@ -1829,15 +1829,15 @@
     </w:pPr>
     <w:rPr/>
   </w:style>
-  <w:style w:type="paragraph" w:styleId="Contenudecadreuser">
-    <w:name w:val="Contenu de cadre (user)"/>
+  <w:style w:type="paragraph" w:styleId="Contenudecadre">
+    <w:name w:val="Contenu de cadre"/>
     <w:basedOn w:val="Normal"/>
     <w:qFormat/>
     <w:pPr/>
     <w:rPr/>
   </w:style>
-  <w:style w:type="paragraph" w:styleId="Contenudetableauuser">
-    <w:name w:val="Contenu de tableau (user)"/>
+  <w:style w:type="paragraph" w:styleId="Contenudetableau">
+    <w:name w:val="Contenu de tableau"/>
     <w:basedOn w:val="Normal"/>
     <w:qFormat/>
     <w:pPr>

</xml_diff>

<commit_message>
fix(sv): fixes from QA for adaptations Europhyt
</commit_message>
<xml_diff>
--- a/sv/doc_templates/detection.docx
+++ b/sv/doc_templates/detection.docx
@@ -114,7 +114,7 @@
     </w:p>
     <w:p>
       <w:pPr>
-        <w:pStyle w:val="Lignehorizontale"/>
+        <w:pStyle w:val="Lignehorizontaleuser"/>
         <w:suppressLineNumbers/>
         <w:pBdr>
           <w:bottom w:val="double" w:sz="2" w:space="0" w:color="808080"/>
@@ -192,7 +192,7 @@
     </w:p>
     <w:p>
       <w:pPr>
-        <w:pStyle w:val="Lignehorizontale"/>
+        <w:pStyle w:val="Lignehorizontaleuser"/>
         <w:suppressLineNumbers/>
         <w:pBdr>
           <w:bottom w:val="double" w:sz="2" w:space="0" w:color="808080"/>
@@ -300,7 +300,7 @@
     </w:p>
     <w:p>
       <w:pPr>
-        <w:pStyle w:val="Lignehorizontale"/>
+        <w:pStyle w:val="Lignehorizontaleuser"/>
         <w:rPr>
           <w:rFonts w:ascii="Arial" w:hAnsi="Arial" w:cs="Arial" w:asciiTheme="minorHAnsi" w:cstheme="minorHAnsi" w:hAnsiTheme="minorHAnsi"/>
           <w:sz w:val="20"/>
@@ -416,7 +416,7 @@
       </w:pPr>
       <w:r>
         <w:rPr/>
-        <w:t>Site d'inspection : {{ lieu.grouped_site_inspection or '-'  }}</w:t>
+        <w:t>Site d'inspection : {{ lieu.site_inspection_label_with_group or '-'  }}</w:t>
       </w:r>
     </w:p>
     <w:p>
@@ -812,7 +812,7 @@
     </w:p>
     <w:p>
       <w:pPr>
-        <w:pStyle w:val="Lignehorizontale"/>
+        <w:pStyle w:val="Lignehorizontaleuser"/>
         <w:rPr>
           <w:rFonts w:ascii="Arial" w:hAnsi="Arial" w:cs="Arial" w:asciiTheme="minorHAnsi" w:cstheme="minorHAnsi" w:hAnsiTheme="minorHAnsi"/>
           <w:sz w:val="20"/>
@@ -1207,7 +1207,7 @@
     </w:p>
     <w:p>
       <w:pPr>
-        <w:pStyle w:val="Lignehorizontale"/>
+        <w:pStyle w:val="Lignehorizontaleuser"/>
         <w:suppressLineNumbers/>
         <w:pBdr>
           <w:bottom w:val="double" w:sz="2" w:space="0" w:color="808080"/>
@@ -1635,7 +1635,7 @@
   </w:style>
   <w:style w:type="paragraph" w:styleId="Heading1">
     <w:name w:val="heading 1"/>
-    <w:basedOn w:val="Titre"/>
+    <w:basedOn w:val="Titreuser"/>
     <w:next w:val="BodyText"/>
     <w:qFormat/>
     <w:pPr>
@@ -1655,7 +1655,7 @@
   </w:style>
   <w:style w:type="paragraph" w:styleId="Heading2">
     <w:name w:val="heading 2"/>
-    <w:basedOn w:val="Titre"/>
+    <w:basedOn w:val="Titreuser"/>
     <w:next w:val="BodyText"/>
     <w:qFormat/>
     <w:pPr>
@@ -1672,7 +1672,7 @@
   </w:style>
   <w:style w:type="paragraph" w:styleId="Heading4">
     <w:name w:val="heading 4"/>
-    <w:basedOn w:val="Titre"/>
+    <w:basedOn w:val="Titreuser"/>
     <w:next w:val="BodyText"/>
     <w:qFormat/>
     <w:pPr>
@@ -1710,7 +1710,7 @@
       <w:spacing w:before="240" w:after="120"/>
     </w:pPr>
     <w:rPr>
-      <w:rFonts w:ascii="Liberation Sans" w:hAnsi="Liberation Sans" w:eastAsia="Noto Sans CJK SC" w:cs="Lohit Devanagari"/>
+      <w:rFonts w:ascii="Liberation Sans" w:hAnsi="Liberation Sans" w:eastAsia="Noto Sans CJK SC" w:cs="Noto Sans Devanagari"/>
       <w:sz w:val="28"/>
       <w:szCs w:val="28"/>
     </w:rPr>
@@ -1768,14 +1768,14 @@
       <w:spacing w:before="240" w:after="120"/>
     </w:pPr>
     <w:rPr>
-      <w:rFonts w:ascii="Liberation Sans" w:hAnsi="Liberation Sans" w:eastAsia="Noto Sans CJK SC" w:cs="Noto Sans Devanagari"/>
+      <w:rFonts w:ascii="Liberation Sans" w:hAnsi="Liberation Sans" w:eastAsia="Noto Sans CJK SC" w:cs="Lohit Devanagari"/>
       <w:sz w:val="28"/>
       <w:szCs w:val="28"/>
     </w:rPr>
   </w:style>
   <w:style w:type="paragraph" w:styleId="Title">
     <w:name w:val="Title"/>
-    <w:basedOn w:val="Titre"/>
+    <w:basedOn w:val="Titreuser"/>
     <w:next w:val="BodyText"/>
     <w:qFormat/>
     <w:pPr>
@@ -1788,8 +1788,8 @@
       <w:szCs w:val="56"/>
     </w:rPr>
   </w:style>
-  <w:style w:type="paragraph" w:styleId="Lignehorizontale">
-    <w:name w:val="Ligne horizontale"/>
+  <w:style w:type="paragraph" w:styleId="Lignehorizontaleuser">
+    <w:name w:val="Ligne horizontale (user)"/>
     <w:basedOn w:val="Normal"/>
     <w:next w:val="BodyText"/>
     <w:qFormat/>
@@ -1805,8 +1805,8 @@
       <w:szCs w:val="12"/>
     </w:rPr>
   </w:style>
-  <w:style w:type="paragraph" w:styleId="Texteprformat">
-    <w:name w:val="Texte préformaté"/>
+  <w:style w:type="paragraph" w:styleId="Texteprformatuser">
+    <w:name w:val="Texte préformaté (user)"/>
     <w:basedOn w:val="Normal"/>
     <w:qFormat/>
     <w:pPr>
@@ -1820,7 +1820,7 @@
   </w:style>
   <w:style w:type="paragraph" w:styleId="LigneH2">
     <w:name w:val="Ligne H 2"/>
-    <w:basedOn w:val="Lignehorizontale"/>
+    <w:basedOn w:val="Lignehorizontaleuser"/>
     <w:qFormat/>
     <w:pPr>
       <w:pBdr>
@@ -1829,15 +1829,15 @@
     </w:pPr>
     <w:rPr/>
   </w:style>
-  <w:style w:type="paragraph" w:styleId="Contenudecadre">
-    <w:name w:val="Contenu de cadre"/>
+  <w:style w:type="paragraph" w:styleId="Contenudecadreuser">
+    <w:name w:val="Contenu de cadre (user)"/>
     <w:basedOn w:val="Normal"/>
     <w:qFormat/>
     <w:pPr/>
     <w:rPr/>
   </w:style>
-  <w:style w:type="paragraph" w:styleId="Contenudetableau">
-    <w:name w:val="Contenu de tableau"/>
+  <w:style w:type="paragraph" w:styleId="Contenudetableauuser">
+    <w:name w:val="Contenu de tableau (user)"/>
     <w:basedOn w:val="Normal"/>
     <w:qFormat/>
     <w:pPr>

</xml_diff>

<commit_message>
feat(sv): adaptations Europhyt exports
- CSV
- docx
</commit_message>
<xml_diff>
--- a/sv/doc_templates/detection.docx
+++ b/sv/doc_templates/detection.docx
@@ -114,7 +114,7 @@
     </w:p>
     <w:p>
       <w:pPr>
-        <w:pStyle w:val="Lignehorizontaleuser"/>
+        <w:pStyle w:val="Lignehorizontale"/>
         <w:suppressLineNumbers/>
         <w:pBdr>
           <w:bottom w:val="double" w:sz="2" w:space="0" w:color="808080"/>
@@ -192,7 +192,7 @@
     </w:p>
     <w:p>
       <w:pPr>
-        <w:pStyle w:val="Lignehorizontaleuser"/>
+        <w:pStyle w:val="Lignehorizontale"/>
         <w:suppressLineNumbers/>
         <w:pBdr>
           <w:bottom w:val="double" w:sz="2" w:space="0" w:color="808080"/>
@@ -269,6 +269,226 @@
     <w:p>
       <w:pPr>
         <w:pStyle w:val="BodyText"/>
+        <w:spacing w:lineRule="auto" w:line="276"/>
+        <w:rPr>
+          <w:rFonts w:ascii="Liberation Serif" w:hAnsi="Liberation Serif"/>
+        </w:rPr>
+      </w:pPr>
+      <w:r>
+        <w:rPr/>
+      </w:r>
+    </w:p>
+    <w:p>
+      <w:pPr>
+        <w:pStyle w:val="Heading4"/>
+        <w:numPr>
+          <w:ilvl w:val="3"/>
+          <w:numId w:val="2"/>
+        </w:numPr>
+        <w:ind w:hanging="0" w:left="0"/>
+        <w:jc w:val="center"/>
+        <w:rPr>
+          <w:rFonts w:ascii="Liberation Serif" w:hAnsi="Liberation Serif"/>
+          <w:sz w:val="20"/>
+          <w:szCs w:val="20"/>
+        </w:rPr>
+      </w:pPr>
+      <w:r>
+        <w:rPr>
+          <w:rFonts w:cs="Arial" w:ascii="Arial" w:hAnsi="Arial"/>
+          <w:sz w:val="20"/>
+          <w:szCs w:val="20"/>
+        </w:rPr>
+        <w:t>Élements infestés</w:t>
+      </w:r>
+    </w:p>
+    <w:p>
+      <w:pPr>
+        <w:pStyle w:val="Lignehorizontaleuser"/>
+        <w:pBdr>
+          <w:bottom w:val="double" w:sz="2" w:space="0" w:color="808080"/>
+        </w:pBdr>
+        <w:rPr>
+          <w:rFonts w:ascii="Arial" w:hAnsi="Arial" w:cs="Arial"/>
+          <w:sz w:val="20"/>
+          <w:szCs w:val="20"/>
+        </w:rPr>
+      </w:pPr>
+      <w:r>
+        <w:rPr>
+          <w:rFonts w:cs="Arial" w:ascii="Arial" w:hAnsi="Arial"/>
+          <w:sz w:val="20"/>
+          <w:szCs w:val="20"/>
+        </w:rPr>
+      </w:r>
+    </w:p>
+    <w:p>
+      <w:pPr>
+        <w:pStyle w:val="BodyText"/>
+        <w:spacing w:lineRule="auto" w:line="276"/>
+        <w:rPr>
+          <w:rFonts w:ascii="Arial" w:hAnsi="Arial" w:cs="Arial"/>
+          <w:sz w:val="20"/>
+          <w:szCs w:val="20"/>
+        </w:rPr>
+      </w:pPr>
+      <w:r>
+        <w:rPr/>
+        <w:t>{%p for element_infeste in object.elements_infestes.all() %}</w:t>
+      </w:r>
+    </w:p>
+    <w:p>
+      <w:pPr>
+        <w:pStyle w:val="BodyText"/>
+        <w:spacing w:lineRule="auto" w:line="276"/>
+        <w:rPr>
+          <w:rFonts w:ascii="Arial" w:hAnsi="Arial" w:cs="Arial"/>
+          <w:sz w:val="20"/>
+          <w:szCs w:val="20"/>
+        </w:rPr>
+      </w:pPr>
+      <w:r>
+        <w:rPr/>
+        <w:t>Nom : {{ element_infeste.get_type_display() or '-'  }}</w:t>
+      </w:r>
+    </w:p>
+    <w:p>
+      <w:pPr>
+        <w:pStyle w:val="BodyText"/>
+        <w:spacing w:lineRule="auto" w:line="276"/>
+        <w:rPr>
+          <w:rFonts w:ascii="Arial" w:hAnsi="Arial" w:cs="Arial"/>
+          <w:sz w:val="20"/>
+          <w:szCs w:val="20"/>
+        </w:rPr>
+      </w:pPr>
+      <w:r>
+        <w:rPr/>
+        <w:t>Espèce : {{ element_infeste.espece or '-' }}</w:t>
+      </w:r>
+    </w:p>
+    <w:p>
+      <w:pPr>
+        <w:pStyle w:val="BodyText"/>
+        <w:spacing w:lineRule="auto" w:line="276"/>
+        <w:rPr>
+          <w:rFonts w:ascii="Arial" w:hAnsi="Arial" w:cs="Arial"/>
+          <w:sz w:val="20"/>
+          <w:szCs w:val="20"/>
+        </w:rPr>
+      </w:pPr>
+      <w:r>
+        <w:rPr/>
+        <w:t>Quantité d'éléments infestés : {{  element_infeste.quantite_with_unite or '-'  }}</w:t>
+      </w:r>
+    </w:p>
+    <w:p>
+      <w:pPr>
+        <w:pStyle w:val="BodyText"/>
+        <w:spacing w:lineRule="auto" w:line="276"/>
+        <w:rPr>
+          <w:rFonts w:ascii="Arial" w:hAnsi="Arial" w:cs="Arial"/>
+          <w:sz w:val="20"/>
+          <w:szCs w:val="20"/>
+        </w:rPr>
+      </w:pPr>
+      <w:r>
+        <w:rPr/>
+        <w:t>Commentaires : {{  element_infeste.comments or '-' }}</w:t>
+      </w:r>
+      <w:r>
+        <w:rPr>
+          <w:rFonts w:cs="Arial"/>
+          <w:sz w:val="24"/>
+          <w:szCs w:val="24"/>
+        </w:rPr>
+        <w:br/>
+      </w:r>
+      <w:r>
+        <w:rPr>
+          <w:rFonts w:cs="Arial"/>
+          <w:i w:val="false"/>
+          <w:iCs w:val="false"/>
+          <w:sz w:val="24"/>
+          <w:szCs w:val="24"/>
+        </w:rPr>
+        <w:t>{% if not loop.last %}</w:t>
+      </w:r>
+    </w:p>
+    <w:p>
+      <w:pPr>
+        <w:pStyle w:val="LigneH2"/>
+        <w:pBdr>
+          <w:bottom w:val="dashed" w:sz="6" w:space="0" w:color="1C1C1C"/>
+        </w:pBdr>
+        <w:rPr>
+          <w:rFonts w:ascii="Liberation Serif" w:hAnsi="Liberation Serif" w:cs="Arial"/>
+          <w:i w:val="false"/>
+          <w:iCs w:val="false"/>
+          <w:sz w:val="24"/>
+          <w:szCs w:val="24"/>
+        </w:rPr>
+      </w:pPr>
+      <w:r>
+        <w:rPr>
+          <w:rFonts w:cs="Arial"/>
+          <w:i w:val="false"/>
+          <w:iCs w:val="false"/>
+          <w:sz w:val="24"/>
+          <w:szCs w:val="24"/>
+        </w:rPr>
+      </w:r>
+    </w:p>
+    <w:p>
+      <w:pPr>
+        <w:pStyle w:val="BodyText"/>
+        <w:spacing w:lineRule="auto" w:line="276"/>
+        <w:rPr>
+          <w:rFonts w:ascii="Liberation Serif" w:hAnsi="Liberation Serif" w:cs="Arial"/>
+          <w:i w:val="false"/>
+          <w:iCs w:val="false"/>
+          <w:sz w:val="24"/>
+          <w:szCs w:val="24"/>
+        </w:rPr>
+      </w:pPr>
+      <w:r>
+        <w:rPr>
+          <w:rFonts w:cs="Arial"/>
+          <w:i w:val="false"/>
+          <w:iCs w:val="false"/>
+          <w:sz w:val="24"/>
+          <w:szCs w:val="24"/>
+        </w:rPr>
+        <w:t>{% endif %}</w:t>
+      </w:r>
+    </w:p>
+    <w:p>
+      <w:pPr>
+        <w:pStyle w:val="BodyText"/>
+        <w:spacing w:lineRule="auto" w:line="276"/>
+        <w:rPr>
+          <w:rFonts w:ascii="Liberation Serif" w:hAnsi="Liberation Serif"/>
+          <w:lang w:val="fr-FR"/>
+        </w:rPr>
+      </w:pPr>
+      <w:r>
+        <w:rPr>
+          <w:rStyle w:val="Citation"/>
+          <w:rFonts w:eastAsia="Noto Serif CJK SC" w:cs="Arial"/>
+          <w:i w:val="false"/>
+          <w:iCs w:val="false"/>
+          <w:color w:val="auto"/>
+          <w:kern w:val="2"/>
+          <w:sz w:val="24"/>
+          <w:szCs w:val="24"/>
+          <w:lang w:val="fr-FR" w:eastAsia="zh-CN" w:bidi="fr-FR"/>
+        </w:rPr>
+        <w:t>{%p endfor %}</w:t>
+      </w:r>
+    </w:p>
+    <w:p>
+      <w:pPr>
+        <w:pStyle w:val="BodyText"/>
         <w:rPr/>
       </w:pPr>
       <w:r>
@@ -300,7 +520,7 @@
     </w:p>
     <w:p>
       <w:pPr>
-        <w:pStyle w:val="Lignehorizontaleuser"/>
+        <w:pStyle w:val="Lignehorizontale"/>
         <w:rPr>
           <w:rFonts w:ascii="Arial" w:hAnsi="Arial" w:cs="Arial" w:asciiTheme="minorHAnsi" w:cstheme="minorHAnsi" w:hAnsiTheme="minorHAnsi"/>
           <w:sz w:val="20"/>
@@ -812,7 +1032,7 @@
     </w:p>
     <w:p>
       <w:pPr>
-        <w:pStyle w:val="Lignehorizontaleuser"/>
+        <w:pStyle w:val="Lignehorizontale"/>
         <w:rPr>
           <w:rFonts w:ascii="Arial" w:hAnsi="Arial" w:cs="Arial" w:asciiTheme="minorHAnsi" w:cstheme="minorHAnsi" w:hAnsiTheme="minorHAnsi"/>
           <w:sz w:val="20"/>
@@ -1207,7 +1427,7 @@
     </w:p>
     <w:p>
       <w:pPr>
-        <w:pStyle w:val="Lignehorizontaleuser"/>
+        <w:pStyle w:val="Lignehorizontale"/>
         <w:suppressLineNumbers/>
         <w:pBdr>
           <w:bottom w:val="double" w:sz="2" w:space="0" w:color="808080"/>
@@ -1635,7 +1855,7 @@
   </w:style>
   <w:style w:type="paragraph" w:styleId="Heading1">
     <w:name w:val="heading 1"/>
-    <w:basedOn w:val="Titreuser"/>
+    <w:basedOn w:val="Titre"/>
     <w:next w:val="BodyText"/>
     <w:qFormat/>
     <w:pPr>
@@ -1655,7 +1875,7 @@
   </w:style>
   <w:style w:type="paragraph" w:styleId="Heading2">
     <w:name w:val="heading 2"/>
-    <w:basedOn w:val="Titreuser"/>
+    <w:basedOn w:val="Titre"/>
     <w:next w:val="BodyText"/>
     <w:qFormat/>
     <w:pPr>
@@ -1672,7 +1892,7 @@
   </w:style>
   <w:style w:type="paragraph" w:styleId="Heading4">
     <w:name w:val="heading 4"/>
-    <w:basedOn w:val="Titreuser"/>
+    <w:basedOn w:val="Titre"/>
     <w:next w:val="BodyText"/>
     <w:qFormat/>
     <w:pPr>
@@ -1710,7 +1930,7 @@
       <w:spacing w:before="240" w:after="120"/>
     </w:pPr>
     <w:rPr>
-      <w:rFonts w:ascii="Liberation Sans" w:hAnsi="Liberation Sans" w:eastAsia="Noto Sans CJK SC" w:cs="Noto Sans Devanagari"/>
+      <w:rFonts w:ascii="Liberation Sans" w:hAnsi="Liberation Sans" w:eastAsia="Noto Sans CJK SC" w:cs="Lohit Devanagari"/>
       <w:sz w:val="28"/>
       <w:szCs w:val="28"/>
     </w:rPr>
@@ -1768,14 +1988,14 @@
       <w:spacing w:before="240" w:after="120"/>
     </w:pPr>
     <w:rPr>
-      <w:rFonts w:ascii="Liberation Sans" w:hAnsi="Liberation Sans" w:eastAsia="Noto Sans CJK SC" w:cs="Lohit Devanagari"/>
+      <w:rFonts w:ascii="Liberation Sans" w:hAnsi="Liberation Sans" w:eastAsia="Noto Sans CJK SC" w:cs="Noto Sans Devanagari"/>
       <w:sz w:val="28"/>
       <w:szCs w:val="28"/>
     </w:rPr>
   </w:style>
   <w:style w:type="paragraph" w:styleId="Title">
     <w:name w:val="Title"/>
-    <w:basedOn w:val="Titreuser"/>
+    <w:basedOn w:val="Titre"/>
     <w:next w:val="BodyText"/>
     <w:qFormat/>
     <w:pPr>
@@ -1788,8 +2008,8 @@
       <w:szCs w:val="56"/>
     </w:rPr>
   </w:style>
-  <w:style w:type="paragraph" w:styleId="Lignehorizontaleuser">
-    <w:name w:val="Ligne horizontale (user)"/>
+  <w:style w:type="paragraph" w:styleId="Lignehorizontale">
+    <w:name w:val="Ligne horizontale"/>
     <w:basedOn w:val="Normal"/>
     <w:next w:val="BodyText"/>
     <w:qFormat/>
@@ -1805,8 +2025,8 @@
       <w:szCs w:val="12"/>
     </w:rPr>
   </w:style>
-  <w:style w:type="paragraph" w:styleId="Texteprformatuser">
-    <w:name w:val="Texte préformaté (user)"/>
+  <w:style w:type="paragraph" w:styleId="Texteprformat">
+    <w:name w:val="Texte préformaté"/>
     <w:basedOn w:val="Normal"/>
     <w:qFormat/>
     <w:pPr>
@@ -1820,7 +2040,7 @@
   </w:style>
   <w:style w:type="paragraph" w:styleId="LigneH2">
     <w:name w:val="Ligne H 2"/>
-    <w:basedOn w:val="Lignehorizontaleuser"/>
+    <w:basedOn w:val="Lignehorizontale"/>
     <w:qFormat/>
     <w:pPr>
       <w:pBdr>
@@ -1829,15 +2049,15 @@
     </w:pPr>
     <w:rPr/>
   </w:style>
-  <w:style w:type="paragraph" w:styleId="Contenudecadreuser">
-    <w:name w:val="Contenu de cadre (user)"/>
+  <w:style w:type="paragraph" w:styleId="Contenudecadre">
+    <w:name w:val="Contenu de cadre"/>
     <w:basedOn w:val="Normal"/>
     <w:qFormat/>
     <w:pPr/>
     <w:rPr/>
   </w:style>
-  <w:style w:type="paragraph" w:styleId="Contenudetableauuser">
-    <w:name w:val="Contenu de tableau (user)"/>
+  <w:style w:type="paragraph" w:styleId="Contenudetableau">
+    <w:name w:val="Contenu de tableau"/>
     <w:basedOn w:val="Normal"/>
     <w:qFormat/>
     <w:pPr>
@@ -1845,6 +2065,21 @@
       <w:suppressLineNumbers/>
     </w:pPr>
     <w:rPr/>
+  </w:style>
+  <w:style w:type="paragraph" w:styleId="Lignehorizontaleuser">
+    <w:name w:val="Ligne horizontale (user)"/>
+    <w:basedOn w:val="Normal"/>
+    <w:qFormat/>
+    <w:pPr>
+      <w:pBdr>
+        <w:bottom w:val="double" w:sz="2" w:space="0" w:color="808080"/>
+      </w:pBdr>
+      <w:spacing w:before="0" w:after="283"/>
+    </w:pPr>
+    <w:rPr>
+      <w:sz w:val="12"/>
+      <w:szCs w:val="12"/>
+    </w:rPr>
   </w:style>
 </w:styles>
 </file>

</xml_diff>